<commit_message>
1.2.0 data pipeline: design doc, requirements agreed
Add DATA_PIPELINE_DESIGN.md/.docx: one pure readiness definition shared by
the pie, scheduler and Scanner selection; a derived (not stored) queue; the
scheduler in the background worker, depth-first per account, stopping at 75
touches in the rolling 24h window; per-field provenance; a decision queue;
build order steps 0-6. Decisions D1-D6 agreed 2026-09-24.

Update DATA_PIPELINE_REQUIREMENTS.md/.docx to the agreed version: section 12
afterthoughts, Appendix A job inventory, all open questions closed.

Co-Authored-By: Claude Opus 5.5 <noreply@anthropic.com>
</commit_message>
<xml_diff>
--- a/DATA_PIPELINE_REQUIREMENTS.docx
+++ b/DATA_PIPELINE_REQUIREMENTS.docx
@@ -38,7 +38,7 @@
         <w:rPr>
           <w:b/>
         </w:rPr>
-        <w:t>Requirements — for review.</w:t>
+        <w:t>Requirements — agreed 2026-09-24.</w:t>
       </w:r>
       <w:r>
         <w:rPr>
@@ -52,7 +52,7 @@
         <w:rPr>
           <w:b w:val="0"/>
         </w:rPr>
-        <w:t>Date: 2026-09-22</w:t>
+        <w:t>Date: 2026-09-22 (review afterthoughts added 2026-09-24, section 12 and Appendix A)</w:t>
       </w:r>
     </w:p>
     <w:p>
@@ -1919,6 +1919,28 @@
       </w:r>
     </w:p>
     <w:p>
+      <w:r>
+        <w:rPr>
+          <w:b/>
+        </w:rPr>
+        <w:t>Decided (2026-09-24):</w:t>
+      </w:r>
+      <w:r>
+        <w:rPr>
+          <w:b w:val="0"/>
+        </w:rPr>
+        <w:t xml:space="preserve"> the bar is **at least 1 contact at one of the seniority levels chosen in</w:t>
+      </w:r>
+    </w:p>
+    <w:p>
+      <w:r>
+        <w:rPr>
+          <w:b w:val="0"/>
+        </w:rPr>
+        <w:t>the Setup wizard**.</w:t>
+      </w:r>
+    </w:p>
+    <w:p>
       <w:pPr>
         <w:pStyle w:val="Heading2"/>
       </w:pPr>
@@ -2759,6 +2781,295 @@
         <w:rPr>
           <w:b/>
         </w:rPr>
+        <w:t>Freshness windows, decided (2026-09-24):</w:t>
+      </w:r>
+    </w:p>
+    <w:tbl>
+      <w:tblPr>
+        <w:tblStyle w:val="TableGrid"/>
+        <w:tblW w:type="auto" w:w="0"/>
+        <w:tblLook w:firstColumn="1" w:firstRow="1" w:lastColumn="0" w:lastRow="0" w:noHBand="0" w:noVBand="1" w:val="04A0"/>
+      </w:tblPr>
+      <w:tblGrid>
+        <w:gridCol w:w="4320"/>
+        <w:gridCol w:w="4320"/>
+      </w:tblGrid>
+      <w:tr>
+        <w:tc>
+          <w:tcPr>
+            <w:tcW w:type="dxa" w:w="4320"/>
+          </w:tcPr>
+          <w:p>
+            <w:r/>
+            <w:r>
+              <w:rPr>
+                <w:b/>
+              </w:rPr>
+              <w:t>Field</w:t>
+            </w:r>
+          </w:p>
+        </w:tc>
+        <w:tc>
+          <w:tcPr>
+            <w:tcW w:type="dxa" w:w="4320"/>
+          </w:tcPr>
+          <w:p>
+            <w:r/>
+            <w:r>
+              <w:rPr>
+                <w:b/>
+              </w:rPr>
+              <w:t>Stays verified for</w:t>
+            </w:r>
+          </w:p>
+        </w:tc>
+      </w:tr>
+      <w:tr>
+        <w:tc>
+          <w:tcPr>
+            <w:tcW w:type="dxa" w:w="4320"/>
+          </w:tcPr>
+          <w:p>
+            <w:r/>
+            <w:r>
+              <w:rPr>
+                <w:b w:val="0"/>
+              </w:rPr>
+              <w:t>LinkedIn identity (company id)</w:t>
+            </w:r>
+          </w:p>
+        </w:tc>
+        <w:tc>
+          <w:tcPr>
+            <w:tcW w:type="dxa" w:w="4320"/>
+          </w:tcPr>
+          <w:p>
+            <w:r/>
+            <w:r>
+              <w:rPr>
+                <w:b w:val="0"/>
+              </w:rPr>
+              <w:t>12 months</w:t>
+            </w:r>
+          </w:p>
+        </w:tc>
+      </w:tr>
+      <w:tr>
+        <w:tc>
+          <w:tcPr>
+            <w:tcW w:type="dxa" w:w="4320"/>
+          </w:tcPr>
+          <w:p>
+            <w:r/>
+            <w:r>
+              <w:rPr>
+                <w:b w:val="0"/>
+              </w:rPr>
+              <w:t>Headcount</w:t>
+            </w:r>
+          </w:p>
+        </w:tc>
+        <w:tc>
+          <w:tcPr>
+            <w:tcW w:type="dxa" w:w="4320"/>
+          </w:tcPr>
+          <w:p>
+            <w:r/>
+            <w:r>
+              <w:rPr>
+                <w:b w:val="0"/>
+              </w:rPr>
+              <w:t>6 months</w:t>
+            </w:r>
+          </w:p>
+        </w:tc>
+      </w:tr>
+      <w:tr>
+        <w:tc>
+          <w:tcPr>
+            <w:tcW w:type="dxa" w:w="4320"/>
+          </w:tcPr>
+          <w:p>
+            <w:r/>
+            <w:r>
+              <w:rPr>
+                <w:b w:val="0"/>
+              </w:rPr>
+              <w:t>Contacts</w:t>
+            </w:r>
+          </w:p>
+        </w:tc>
+        <w:tc>
+          <w:tcPr>
+            <w:tcW w:type="dxa" w:w="4320"/>
+          </w:tcPr>
+          <w:p>
+            <w:r/>
+            <w:r>
+              <w:rPr>
+                <w:b w:val="0"/>
+              </w:rPr>
+              <w:t>6 months (people change jobs)</w:t>
+            </w:r>
+          </w:p>
+        </w:tc>
+      </w:tr>
+      <w:tr>
+        <w:tc>
+          <w:tcPr>
+            <w:tcW w:type="dxa" w:w="4320"/>
+          </w:tcPr>
+          <w:p>
+            <w:r/>
+            <w:r>
+              <w:rPr>
+                <w:b w:val="0"/>
+              </w:rPr>
+              <w:t>Revenue</w:t>
+            </w:r>
+          </w:p>
+        </w:tc>
+        <w:tc>
+          <w:tcPr>
+            <w:tcW w:type="dxa" w:w="4320"/>
+          </w:tcPr>
+          <w:p>
+            <w:r/>
+            <w:r>
+              <w:rPr>
+                <w:b w:val="0"/>
+              </w:rPr>
+              <w:t>12 months</w:t>
+            </w:r>
+          </w:p>
+        </w:tc>
+      </w:tr>
+    </w:tbl>
+    <w:p/>
+    <w:p>
+      <w:r>
+        <w:rPr>
+          <w:b/>
+        </w:rPr>
+        <w:t>Minimum evidence quality, decided (2026-09-24).</w:t>
+      </w:r>
+      <w:r>
+        <w:rPr>
+          <w:b w:val="0"/>
+        </w:rPr>
+        <w:t xml:space="preserve"> A field counts as verified only if it came</w:t>
+      </w:r>
+    </w:p>
+    <w:p>
+      <w:r>
+        <w:rPr>
+          <w:b w:val="0"/>
+        </w:rPr>
+        <w:t>from one of these sources:</w:t>
+      </w:r>
+    </w:p>
+    <w:p>
+      <w:pPr>
+        <w:pStyle w:val="ListNumber"/>
+      </w:pPr>
+      <w:r>
+        <w:rPr>
+          <w:b/>
+        </w:rPr>
+        <w:t>LinkedIn</w:t>
+      </w:r>
+      <w:r>
+        <w:rPr>
+          <w:b w:val="0"/>
+        </w:rPr>
+        <w:t>, which is authoritative;</w:t>
+      </w:r>
+    </w:p>
+    <w:p>
+      <w:pPr>
+        <w:pStyle w:val="ListNumber"/>
+      </w:pPr>
+      <w:r>
+        <w:rPr>
+          <w:b/>
+        </w:rPr>
+        <w:t>web research with a cited source</w:t>
+      </w:r>
+      <w:r>
+        <w:rPr>
+          <w:b w:val="0"/>
+        </w:rPr>
+        <w:t>;</w:t>
+      </w:r>
+    </w:p>
+    <w:p>
+      <w:pPr>
+        <w:pStyle w:val="ListNumber"/>
+      </w:pPr>
+      <w:r>
+        <w:rPr>
+          <w:b/>
+        </w:rPr>
+        <w:t>the research workbook, where the account's Evidence Status is Sufficient Evidence or better</w:t>
+      </w:r>
+    </w:p>
+    <w:p>
+      <w:r>
+        <w:rPr>
+          <w:b w:val="0"/>
+        </w:rPr>
+        <w:t xml:space="preserve">   (Sufficient, Rich or Full).</w:t>
+      </w:r>
+    </w:p>
+    <w:p>
+      <w:r>
+        <w:rPr>
+          <w:b w:val="0"/>
+        </w:rPr>
+        <w:t>Anything below that (Provisional or Insufficient Evidence, not yet researched, or a value with no</w:t>
+      </w:r>
+    </w:p>
+    <w:p>
+      <w:r>
+        <w:rPr>
+          <w:b w:val="0"/>
+        </w:rPr>
+        <w:t xml:space="preserve">source) is treated as </w:t>
+      </w:r>
+      <w:r>
+        <w:rPr>
+          <w:b/>
+        </w:rPr>
+        <w:t>unverified</w:t>
+      </w:r>
+      <w:r>
+        <w:rPr>
+          <w:b w:val="0"/>
+        </w:rPr>
+        <w:t>, and the pipeline fetches the value from LinkedIn. This is the</w:t>
+      </w:r>
+    </w:p>
+    <w:p>
+      <w:r>
+        <w:rPr>
+          <w:b w:val="0"/>
+        </w:rPr>
+        <w:t>quality-versus-speed setting: with no threshold, "verified" would mean only "a value is present";</w:t>
+      </w:r>
+    </w:p>
+    <w:p>
+      <w:r>
+        <w:rPr>
+          <w:b w:val="0"/>
+        </w:rPr>
+        <w:t>accepting LinkedIn alone would cost a LinkedIn visit per field and waste web research.</w:t>
+      </w:r>
+    </w:p>
+    <w:p>
+      <w:r>
+        <w:rPr>
+          <w:b/>
+        </w:rPr>
         <w:t>R5.3 — Staleness must expire verification.</w:t>
       </w:r>
       <w:r>
@@ -3840,15 +4151,29 @@
         <w:rPr>
           <w:b w:val="0"/>
         </w:rPr>
-        <w:t xml:space="preserve">   needs, computed from the user's own targeting configuration.** What remains is narrower — the</w:t>
-      </w:r>
-    </w:p>
-    <w:p>
-      <w:r>
-        <w:rPr>
-          <w:b w:val="0"/>
-        </w:rPr>
-        <w:t xml:space="preserve">   freshness thresholds in R5.2, and the exact contact bar in R3.7 (how many, at what seniority).</w:t>
+        <w:t xml:space="preserve">   needs, computed from the user's own targeting configuration.** The contact bar (R3.7) and the</w:t>
+      </w:r>
+    </w:p>
+    <w:p>
+      <w:r>
+        <w:rPr>
+          <w:b w:val="0"/>
+        </w:rPr>
+        <w:t xml:space="preserve">   freshness windows (R5.2) are now decided too, and so is the minimum evidence quality (R5.2).</w:t>
+      </w:r>
+    </w:p>
+    <w:p>
+      <w:r>
+        <w:rPr>
+          <w:b w:val="0"/>
+        </w:rPr>
+        <w:t xml:space="preserve">   </w:t>
+      </w:r>
+      <w:r>
+        <w:rPr>
+          <w:b/>
+        </w:rPr>
+        <w:t>No open questions remain.</w:t>
       </w:r>
     </w:p>
     <w:p>
@@ -3857,23 +4182,17 @@
       </w:pPr>
       <w:r>
         <w:rPr>
-          <w:b/>
-        </w:rPr>
-        <w:t>How large is the starting subset?</w:t>
-      </w:r>
-      <w:r>
-        <w:rPr>
-          <w:b w:val="0"/>
-        </w:rPr>
-        <w:t xml:space="preserve"> Is the first target a fixed number (100), a priority tier</w:t>
-      </w:r>
-    </w:p>
-    <w:p>
-      <w:r>
-        <w:rPr>
-          <w:b w:val="0"/>
-        </w:rPr>
-        <w:t xml:space="preserve">   (all of P1), or whatever can be completed in the first 24 hours?</w:t>
+          <w:b w:val="0"/>
+        </w:rPr>
+        <w:t>~~How large is the starting subset?~~ **Answered (R12.3): whatever can be completed within one</w:t>
+      </w:r>
+    </w:p>
+    <w:p>
+      <w:r>
+        <w:rPr>
+          <w:b w:val="0"/>
+        </w:rPr>
+        <w:t xml:space="preserve">   day's LinkedIn touch budget, not a fixed number.**</w:t>
       </w:r>
     </w:p>
     <w:p>
@@ -3882,23 +4201,25 @@
       </w:pPr>
       <w:r>
         <w:rPr>
-          <w:b/>
-        </w:rPr>
-        <w:t>How much consent is enough?</w:t>
-      </w:r>
-      <w:r>
-        <w:rPr>
-          <w:b w:val="0"/>
-        </w:rPr>
-        <w:t xml:space="preserve"> One approval per pipeline run, per day, or a standing</w:t>
-      </w:r>
-    </w:p>
-    <w:p>
-      <w:r>
-        <w:rPr>
-          <w:b w:val="0"/>
-        </w:rPr>
-        <w:t xml:space="preserve">   "keep my data ready" setting with a budget cap?</w:t>
+          <w:b w:val="0"/>
+        </w:rPr>
+        <w:t>~~How much consent is enough?~~ **Answered (R12.2): one standing consent at the end of</w:t>
+      </w:r>
+    </w:p>
+    <w:p>
+      <w:r>
+        <w:rPr>
+          <w:b w:val="0"/>
+        </w:rPr>
+        <w:t xml:space="preserve">   onboarding; after that the pipeline plans and runs each day without asking.** Web research</w:t>
+      </w:r>
+    </w:p>
+    <w:p>
+      <w:r>
+        <w:rPr>
+          <w:b w:val="0"/>
+        </w:rPr>
+        <w:t xml:space="preserve">   has its own consent with a spending budget (R12.7).</w:t>
       </w:r>
     </w:p>
     <w:p>
@@ -3907,23 +4228,15 @@
       </w:pPr>
       <w:r>
         <w:rPr>
+          <w:b w:val="0"/>
+        </w:rPr>
+        <w:t xml:space="preserve">~~Freshness windows.~~ </w:t>
+      </w:r>
+      <w:r>
+        <w:rPr>
           <w:b/>
         </w:rPr>
-        <w:t>Freshness windows.</w:t>
-      </w:r>
-      <w:r>
-        <w:rPr>
-          <w:b w:val="0"/>
-        </w:rPr>
-        <w:t xml:space="preserve"> How long does each kind of field stay verified — headcount, revenue,</w:t>
-      </w:r>
-    </w:p>
-    <w:p>
-      <w:r>
-        <w:rPr>
-          <w:b w:val="0"/>
-        </w:rPr>
-        <w:t xml:space="preserve">   contacts, LinkedIn identity? These plainly differ.</w:t>
+        <w:t>Answered (R5.2).</w:t>
       </w:r>
     </w:p>
     <w:p>
@@ -3932,23 +4245,62 @@
       </w:pPr>
       <w:r>
         <w:rPr>
-          <w:b/>
-        </w:rPr>
-        <w:t>Scanner integration.</w:t>
-      </w:r>
-      <w:r>
-        <w:rPr>
-          <w:b w:val="0"/>
-        </w:rPr>
-        <w:t xml:space="preserve"> Signals are continuous and entity enrichment converges; do they share</w:t>
-      </w:r>
-    </w:p>
-    <w:p>
-      <w:r>
-        <w:rPr>
-          <w:b w:val="0"/>
-        </w:rPr>
-        <w:t xml:space="preserve">   one budget and one queue, or two?</w:t>
+          <w:b w:val="0"/>
+        </w:rPr>
+        <w:t>~~Scanner integration.~~ **Answered (2026-09-24): one daily LinkedIn budget (R12.2.5) and one</w:t>
+      </w:r>
+    </w:p>
+    <w:p>
+      <w:r>
+        <w:rPr>
+          <w:b w:val="0"/>
+        </w:rPr>
+        <w:t xml:space="preserve">   scheduler.**</w:t>
+      </w:r>
+    </w:p>
+    <w:p>
+      <w:r>
+        <w:rPr>
+          <w:b w:val="0"/>
+        </w:rPr>
+        <w:t xml:space="preserve">   The Scanner needs no queue of its own: scans are started by the user and run in one go. When the</w:t>
+      </w:r>
+    </w:p>
+    <w:p>
+      <w:r>
+        <w:rPr>
+          <w:b w:val="0"/>
+        </w:rPr>
+        <w:t xml:space="preserve">   user starts a scan, the pipeline pauses at the end of its current account and resumes after the</w:t>
+      </w:r>
+    </w:p>
+    <w:p>
+      <w:r>
+        <w:rPr>
+          <w:b w:val="0"/>
+        </w:rPr>
+        <w:t xml:space="preserve">   scan. The existing one-job-at-a-time guard (</w:t>
+      </w:r>
+      <w:r>
+        <w:rPr>
+          <w:rFonts w:ascii="Consolas" w:hAnsi="Consolas"/>
+          <w:b w:val="0"/>
+        </w:rPr>
+        <w:t>batch-jobs.js</w:t>
+      </w:r>
+      <w:r>
+        <w:rPr>
+          <w:b w:val="0"/>
+        </w:rPr>
+        <w:t>) already enforces the "one at a</w:t>
+      </w:r>
+    </w:p>
+    <w:p>
+      <w:r>
+        <w:rPr>
+          <w:b w:val="0"/>
+        </w:rPr>
+        <w:t xml:space="preserve">   time" part.</w:t>
       </w:r>
     </w:p>
     <w:p>
@@ -3957,23 +4309,17 @@
       </w:pPr>
       <w:r>
         <w:rPr>
-          <w:b/>
-        </w:rPr>
-        <w:t>Migration.</w:t>
-      </w:r>
-      <w:r>
-        <w:rPr>
-          <w:b w:val="0"/>
-        </w:rPr>
-        <w:t xml:space="preserve"> What happens to an existing installation whose 541 accounts have never been</w:t>
-      </w:r>
-    </w:p>
-    <w:p>
-      <w:r>
-        <w:rPr>
-          <w:b w:val="0"/>
-        </w:rPr>
-        <w:t xml:space="preserve">   assessed against a readiness bar?</w:t>
+          <w:b w:val="0"/>
+        </w:rPr>
+        <w:t>~~Migration.~~ **Answered (R12.8): no separate step; accounts are rated on first run, and</w:t>
+      </w:r>
+    </w:p>
+    <w:p>
+      <w:r>
+        <w:rPr>
+          <w:b w:val="0"/>
+        </w:rPr>
+        <w:t xml:space="preserve">   existing users give the standing consent once after the update.**</w:t>
       </w:r>
     </w:p>
     <w:p>
@@ -4205,6 +4551,3739 @@
           <w:b w:val="0"/>
         </w:rPr>
         <w:t>decides *which* job, or *what next*.</w:t>
+      </w:r>
+    </w:p>
+    <w:p>
+      <w:pPr>
+        <w:pStyle w:val="Heading2"/>
+      </w:pPr>
+      <w:r>
+        <w:rPr>
+          <w:b w:val="0"/>
+        </w:rPr>
+        <w:t>12. Afterthoughts from review (2026-09-24)</w:t>
+      </w:r>
+    </w:p>
+    <w:p>
+      <w:pPr>
+        <w:pStyle w:val="Heading3"/>
+      </w:pPr>
+      <w:r>
+        <w:rPr>
+          <w:b w:val="0"/>
+        </w:rPr>
+        <w:t>12.1 Pipeline status: a pie chart on the Target Accounts Dashboard</w:t>
+      </w:r>
+    </w:p>
+    <w:p>
+      <w:r>
+        <w:rPr>
+          <w:b/>
+        </w:rPr>
+        <w:t>R12.1.1</w:t>
+      </w:r>
+      <w:r>
+        <w:rPr>
+          <w:b w:val="0"/>
+        </w:rPr>
+        <w:t xml:space="preserve"> — Pipeline status is shown as a **pie chart at the top of the Target Accounts</w:t>
+      </w:r>
+    </w:p>
+    <w:p>
+      <w:r>
+        <w:rPr>
+          <w:b w:val="0"/>
+        </w:rPr>
+        <w:t>Dashboard**, next to the existing pies, not as a separate menu page. One slice per state:</w:t>
+      </w:r>
+    </w:p>
+    <w:tbl>
+      <w:tblPr>
+        <w:tblStyle w:val="TableGrid"/>
+        <w:tblW w:type="auto" w:w="0"/>
+        <w:tblLook w:firstColumn="1" w:firstRow="1" w:lastColumn="0" w:lastRow="0" w:noHBand="0" w:noVBand="1" w:val="04A0"/>
+      </w:tblPr>
+      <w:tblGrid>
+        <w:gridCol w:w="4320"/>
+        <w:gridCol w:w="4320"/>
+      </w:tblGrid>
+      <w:tr>
+        <w:tc>
+          <w:tcPr>
+            <w:tcW w:type="dxa" w:w="4320"/>
+          </w:tcPr>
+          <w:p>
+            <w:r/>
+            <w:r>
+              <w:rPr>
+                <w:b/>
+              </w:rPr>
+              <w:t>Slice</w:t>
+            </w:r>
+          </w:p>
+        </w:tc>
+        <w:tc>
+          <w:tcPr>
+            <w:tcW w:type="dxa" w:w="4320"/>
+          </w:tcPr>
+          <w:p>
+            <w:r/>
+            <w:r>
+              <w:rPr>
+                <w:b/>
+              </w:rPr>
+              <w:t>Meaning</w:t>
+            </w:r>
+          </w:p>
+        </w:tc>
+      </w:tr>
+      <w:tr>
+        <w:tc>
+          <w:tcPr>
+            <w:tcW w:type="dxa" w:w="4320"/>
+          </w:tcPr>
+          <w:p>
+            <w:r/>
+            <w:r>
+              <w:rPr>
+                <w:b/>
+              </w:rPr>
+              <w:t>Ready</w:t>
+            </w:r>
+          </w:p>
+        </w:tc>
+        <w:tc>
+          <w:tcPr>
+            <w:tcW w:type="dxa" w:w="4320"/>
+          </w:tcPr>
+          <w:p>
+            <w:r/>
+            <w:r>
+              <w:rPr>
+                <w:b w:val="0"/>
+              </w:rPr>
+              <w:t>Meets the full bar (R3.3).</w:t>
+            </w:r>
+          </w:p>
+        </w:tc>
+      </w:tr>
+      <w:tr>
+        <w:tc>
+          <w:tcPr>
+            <w:tcW w:type="dxa" w:w="4320"/>
+          </w:tcPr>
+          <w:p>
+            <w:r/>
+            <w:r>
+              <w:rPr>
+                <w:b/>
+              </w:rPr>
+              <w:t>Usable</w:t>
+            </w:r>
+          </w:p>
+        </w:tc>
+        <w:tc>
+          <w:tcPr>
+            <w:tcW w:type="dxa" w:w="4320"/>
+          </w:tcPr>
+          <w:p>
+            <w:r/>
+            <w:r>
+              <w:rPr>
+                <w:b w:val="0"/>
+              </w:rPr>
+              <w:t>Scannable, enrichment still missing (R3.2).</w:t>
+            </w:r>
+          </w:p>
+        </w:tc>
+      </w:tr>
+      <w:tr>
+        <w:tc>
+          <w:tcPr>
+            <w:tcW w:type="dxa" w:w="4320"/>
+          </w:tcPr>
+          <w:p>
+            <w:r/>
+            <w:r>
+              <w:rPr>
+                <w:b/>
+              </w:rPr>
+              <w:t>In progress</w:t>
+            </w:r>
+          </w:p>
+        </w:tc>
+        <w:tc>
+          <w:tcPr>
+            <w:tcW w:type="dxa" w:w="4320"/>
+          </w:tcPr>
+          <w:p>
+            <w:r/>
+            <w:r>
+              <w:rPr>
+                <w:b w:val="0"/>
+              </w:rPr>
+              <w:t>Incomplete, and the pipeline still has work queued for it.</w:t>
+            </w:r>
+          </w:p>
+        </w:tc>
+      </w:tr>
+      <w:tr>
+        <w:tc>
+          <w:tcPr>
+            <w:tcW w:type="dxa" w:w="4320"/>
+          </w:tcPr>
+          <w:p>
+            <w:r/>
+            <w:r>
+              <w:rPr>
+                <w:b/>
+              </w:rPr>
+              <w:t>Needs your decision</w:t>
+            </w:r>
+          </w:p>
+        </w:tc>
+        <w:tc>
+          <w:tcPr>
+            <w:tcW w:type="dxa" w:w="4320"/>
+          </w:tcPr>
+          <w:p>
+            <w:r/>
+            <w:r>
+              <w:rPr>
+                <w:b w:val="0"/>
+              </w:rPr>
+              <w:t>Waiting on a human judgement (R12.4).</w:t>
+            </w:r>
+          </w:p>
+        </w:tc>
+      </w:tr>
+      <w:tr>
+        <w:tc>
+          <w:tcPr>
+            <w:tcW w:type="dxa" w:w="4320"/>
+          </w:tcPr>
+          <w:p>
+            <w:r/>
+            <w:r>
+              <w:rPr>
+                <w:b/>
+              </w:rPr>
+              <w:t>Lacking evidence</w:t>
+            </w:r>
+          </w:p>
+        </w:tc>
+        <w:tc>
+          <w:tcPr>
+            <w:tcW w:type="dxa" w:w="4320"/>
+          </w:tcPr>
+          <w:p>
+            <w:r/>
+            <w:r>
+              <w:rPr>
+                <w:b w:val="0"/>
+              </w:rPr>
+              <w:t>Went through every applicable job and still cannot reach Usable (R12.5).</w:t>
+            </w:r>
+          </w:p>
+        </w:tc>
+      </w:tr>
+    </w:tbl>
+    <w:p/>
+    <w:p>
+      <w:r>
+        <w:rPr>
+          <w:b/>
+        </w:rPr>
+        <w:t>R12.1.2</w:t>
+      </w:r>
+      <w:r>
+        <w:rPr>
+          <w:b w:val="0"/>
+        </w:rPr>
+        <w:t xml:space="preserve"> — </w:t>
+      </w:r>
+      <w:r>
+        <w:rPr>
+          <w:b/>
+        </w:rPr>
+        <w:t>Clicking a slice filters the accounts table to that state.</w:t>
+      </w:r>
+      <w:r>
+        <w:rPr>
+          <w:b w:val="0"/>
+        </w:rPr>
+        <w:t xml:space="preserve"> The dashboard's</w:t>
+      </w:r>
+    </w:p>
+    <w:p>
+      <w:r>
+        <w:rPr>
+          <w:b w:val="0"/>
+        </w:rPr>
+        <w:t>existing status pies already work this way (</w:t>
+      </w:r>
+      <w:r>
+        <w:rPr>
+          <w:rFonts w:ascii="Consolas" w:hAnsi="Consolas"/>
+          <w:b w:val="0"/>
+        </w:rPr>
+        <w:t>onSliceClick</w:t>
+      </w:r>
+      <w:r>
+        <w:rPr>
+          <w:b w:val="0"/>
+        </w:rPr>
+        <w:t>). The filtered table is the detailed</w:t>
+      </w:r>
+    </w:p>
+    <w:p>
+      <w:r>
+        <w:rPr>
+          <w:b w:val="0"/>
+        </w:rPr>
+        <w:t>view, so no separate page is needed. This is also how the user finds the accounts that failed.</w:t>
+      </w:r>
+    </w:p>
+    <w:p>
+      <w:r>
+        <w:rPr>
+          <w:b/>
+        </w:rPr>
+        <w:t>R12.1.3</w:t>
+      </w:r>
+      <w:r>
+        <w:rPr>
+          <w:b w:val="0"/>
+        </w:rPr>
+        <w:t xml:space="preserve"> — Under the pie, one line states progress honestly (R6.4.4): *"38 ready · about 25</w:t>
+      </w:r>
+    </w:p>
+    <w:p>
+      <w:r>
+        <w:rPr>
+          <w:b w:val="0"/>
+        </w:rPr>
+        <w:t>more expected by end of day"*.</w:t>
+      </w:r>
+    </w:p>
+    <w:p>
+      <w:r>
+        <w:rPr>
+          <w:b/>
+        </w:rPr>
+        <w:t>R12.1.4</w:t>
+      </w:r>
+      <w:r>
+        <w:rPr>
+          <w:b w:val="0"/>
+        </w:rPr>
+        <w:t xml:space="preserve"> — The pie updates when an account changes state, not on a timer. The pipeline writes</w:t>
+      </w:r>
+    </w:p>
+    <w:p>
+      <w:r>
+        <w:rPr>
+          <w:b w:val="0"/>
+        </w:rPr>
+        <w:t xml:space="preserve">to storage, and the dashboard redraws from </w:t>
+      </w:r>
+      <w:r>
+        <w:rPr>
+          <w:rFonts w:ascii="Consolas" w:hAnsi="Consolas"/>
+          <w:b w:val="0"/>
+        </w:rPr>
+        <w:t>chrome.storage.onChanged</w:t>
+      </w:r>
+      <w:r>
+        <w:rPr>
+          <w:b w:val="0"/>
+        </w:rPr>
+        <w:t>. That is immediate and costs</w:t>
+      </w:r>
+    </w:p>
+    <w:p>
+      <w:r>
+        <w:rPr>
+          <w:b w:val="0"/>
+        </w:rPr>
+        <w:t>nothing when idle, whereas polling every minute would do work whether or not anything changed.</w:t>
+      </w:r>
+    </w:p>
+    <w:p>
+      <w:pPr>
+        <w:pStyle w:val="Heading3"/>
+      </w:pPr>
+      <w:r>
+        <w:rPr>
+          <w:b w:val="0"/>
+        </w:rPr>
+        <w:t>12.2 The pipeline runs by itself after one consent</w:t>
+      </w:r>
+    </w:p>
+    <w:p>
+      <w:r>
+        <w:rPr>
+          <w:b/>
+        </w:rPr>
+        <w:t>R12.2.1</w:t>
+      </w:r>
+      <w:r>
+        <w:rPr>
+          <w:b w:val="0"/>
+        </w:rPr>
+        <w:t xml:space="preserve"> — The user is asked </w:t>
+      </w:r>
+      <w:r>
+        <w:rPr>
+          <w:b/>
+        </w:rPr>
+        <w:t>once</w:t>
+      </w:r>
+      <w:r>
+        <w:rPr>
+          <w:b w:val="0"/>
+        </w:rPr>
+        <w:t>, at the end of the onboarding wizard, and never again.</w:t>
+      </w:r>
+    </w:p>
+    <w:p>
+      <w:r>
+        <w:rPr>
+          <w:b w:val="0"/>
+        </w:rPr>
+        <w:t>The wizard's last step tells them whether their settings are enough to start working (a target</w:t>
+      </w:r>
+    </w:p>
+    <w:p>
+      <w:r>
+        <w:rPr>
+          <w:b w:val="0"/>
+        </w:rPr>
+        <w:t>region, sizes and seniority levels are set, and LinkedIn is signed in). If they are, it offers the</w:t>
+      </w:r>
+    </w:p>
+    <w:p>
+      <w:r>
+        <w:rPr>
+          <w:b w:val="0"/>
+        </w:rPr>
+        <w:t>single consent: *"Keep my accounts ready automatically, within my daily LinkedIn limit"*.</w:t>
+      </w:r>
+    </w:p>
+    <w:p>
+      <w:r>
+        <w:rPr>
+          <w:b/>
+        </w:rPr>
+        <w:t>R12.2.2</w:t>
+      </w:r>
+      <w:r>
+        <w:rPr>
+          <w:b w:val="0"/>
+        </w:rPr>
+        <w:t xml:space="preserve"> — After that consent, SalesTeam **plans each day's work by itself and starts it</w:t>
+      </w:r>
+    </w:p>
+    <w:p>
+      <w:r>
+        <w:rPr>
+          <w:b w:val="0"/>
+        </w:rPr>
+        <w:t>without asking**. It works out how many accounts it can bring to Ready within today's touch budget,</w:t>
+      </w:r>
+    </w:p>
+    <w:p>
+      <w:r>
+        <w:rPr>
+          <w:b w:val="0"/>
+        </w:rPr>
+        <w:t>queues the jobs depth-first (R6.4.1) and runs them. It replans:</w:t>
+      </w:r>
+    </w:p>
+    <w:p>
+      <w:pPr>
+        <w:pStyle w:val="ListBullet"/>
+      </w:pPr>
+      <w:r>
+        <w:rPr>
+          <w:b w:val="0"/>
+        </w:rPr>
+        <w:t>on the first time Chrome is open on a new day (the touch budget has reset);</w:t>
+      </w:r>
+    </w:p>
+    <w:p>
+      <w:pPr>
+        <w:pStyle w:val="ListBullet"/>
+      </w:pPr>
+      <w:r>
+        <w:rPr>
+          <w:b w:val="0"/>
+        </w:rPr>
+        <w:t>straight after any source delivers data (workbook import, HubSpot import, a finished Discovery</w:t>
+      </w:r>
+    </w:p>
+    <w:p>
+      <w:r>
+        <w:rPr>
+          <w:b w:val="0"/>
+        </w:rPr>
+        <w:t xml:space="preserve">  run, which is merged automatically per R12.6);</w:t>
+      </w:r>
+    </w:p>
+    <w:p>
+      <w:pPr>
+        <w:pStyle w:val="ListBullet"/>
+      </w:pPr>
+      <w:r>
+        <w:rPr>
+          <w:b w:val="0"/>
+        </w:rPr>
+        <w:t>when the day's plan finishes early and budget remains.</w:t>
+      </w:r>
+    </w:p>
+    <w:p>
+      <w:r>
+        <w:rPr>
+          <w:b/>
+        </w:rPr>
+        <w:t>R12.2.3 — A change of posture that needs a deliberate decision.</w:t>
+      </w:r>
+      <w:r>
+        <w:rPr>
+          <w:b w:val="0"/>
+        </w:rPr>
+        <w:t xml:space="preserve"> Today the codebase runs</w:t>
+      </w:r>
+    </w:p>
+    <w:p>
+      <w:r>
+        <w:rPr>
+          <w:b w:val="0"/>
+        </w:rPr>
+        <w:t xml:space="preserve">nothing on its own: </w:t>
+      </w:r>
+      <w:r>
+        <w:rPr>
+          <w:rFonts w:ascii="Consolas" w:hAnsi="Consolas"/>
+          <w:b w:val="0"/>
+        </w:rPr>
+        <w:t>discovery-queue.js</w:t>
+      </w:r>
+      <w:r>
+        <w:rPr>
+          <w:b w:val="0"/>
+        </w:rPr>
+        <w:t xml:space="preserve"> says there is *"deliberately no chrome.alarms anywhere in</w:t>
+      </w:r>
+    </w:p>
+    <w:p>
+      <w:r>
+        <w:rPr>
+          <w:b w:val="0"/>
+        </w:rPr>
+        <w:t>this codebase, ever"*, and the public messaging promises *"user-initiated scans"*. The standing</w:t>
+      </w:r>
+    </w:p>
+    <w:p>
+      <w:r>
+        <w:rPr>
+          <w:b w:val="0"/>
+        </w:rPr>
+        <w:t>consent in R12.2.1 is what keeps the new behaviour user-initiated: the user starts it once and can</w:t>
+      </w:r>
+    </w:p>
+    <w:p>
+      <w:r>
+        <w:rPr>
+          <w:b w:val="0"/>
+        </w:rPr>
+        <w:t>switch it off. The store listing, website and Help must be updated to say so before 1.2.0 ships.</w:t>
+      </w:r>
+    </w:p>
+    <w:p>
+      <w:r>
+        <w:rPr>
+          <w:b/>
+        </w:rPr>
+        <w:t>Decided (2026-09-24): approved.</w:t>
+      </w:r>
+      <w:r>
+        <w:rPr>
+          <w:b w:val="0"/>
+        </w:rPr>
+        <w:t xml:space="preserve"> The user starts the pipeline once. Because the daily</w:t>
+      </w:r>
+    </w:p>
+    <w:p>
+      <w:r>
+        <w:rPr>
+          <w:b w:val="0"/>
+        </w:rPr>
+        <w:t>LinkedIn limit makes it take several days, it carries on by itself after that first start, and it</w:t>
+      </w:r>
+    </w:p>
+    <w:p>
+      <w:r>
+        <w:rPr>
+          <w:b w:val="0"/>
+        </w:rPr>
+        <w:t>is still work the user started. Public wording to use: *"You start it once; SalesTeam keeps your</w:t>
+      </w:r>
+    </w:p>
+    <w:p>
+      <w:r>
+        <w:rPr>
+          <w:b w:val="0"/>
+        </w:rPr>
+        <w:t>accounts ready within your daily LinkedIn limit, visible in your browser."*</w:t>
+      </w:r>
+    </w:p>
+    <w:p>
+      <w:r>
+        <w:rPr>
+          <w:b/>
+        </w:rPr>
+        <w:t>R12.2.4 — Not at midnight.</w:t>
+      </w:r>
+      <w:r>
+        <w:rPr>
+          <w:b w:val="0"/>
+        </w:rPr>
+        <w:t xml:space="preserve"> The pipeline runs in the user's own Chrome and visits LinkedIn in</w:t>
+      </w:r>
+    </w:p>
+    <w:p>
+      <w:r>
+        <w:rPr>
+          <w:b w:val="0"/>
+        </w:rPr>
+        <w:t>it, so it can only run while Chrome is open. At midnight the laptop is usually closed. Replanning</w:t>
+      </w:r>
+    </w:p>
+    <w:p>
+      <w:r>
+        <w:rPr>
+          <w:b w:val="0"/>
+        </w:rPr>
+        <w:t xml:space="preserve">therefore happens </w:t>
+      </w:r>
+      <w:r>
+        <w:rPr>
+          <w:b/>
+        </w:rPr>
+        <w:t>the first time Chrome is open each day</w:t>
+      </w:r>
+      <w:r>
+        <w:rPr>
+          <w:b w:val="0"/>
+        </w:rPr>
+        <w:t>, the same check-when-open pattern the</w:t>
+      </w:r>
+    </w:p>
+    <w:p>
+      <w:r>
+        <w:rPr>
+          <w:b w:val="0"/>
+        </w:rPr>
+        <w:t>daily backup already uses (</w:t>
+      </w:r>
+      <w:r>
+        <w:rPr>
+          <w:rFonts w:ascii="Consolas" w:hAnsi="Consolas"/>
+          <w:b w:val="0"/>
+        </w:rPr>
+        <w:t>runAutoBackupIfDue</w:t>
+      </w:r>
+      <w:r>
+        <w:rPr>
+          <w:b w:val="0"/>
+        </w:rPr>
+        <w:t xml:space="preserve">). No </w:t>
+      </w:r>
+      <w:r>
+        <w:rPr>
+          <w:rFonts w:ascii="Consolas" w:hAnsi="Consolas"/>
+          <w:b w:val="0"/>
+        </w:rPr>
+        <w:t>chrome.alarms</w:t>
+      </w:r>
+      <w:r>
+        <w:rPr>
+          <w:b w:val="0"/>
+        </w:rPr>
+        <w:t xml:space="preserve"> is needed.</w:t>
+      </w:r>
+    </w:p>
+    <w:p>
+      <w:r>
+        <w:rPr>
+          <w:b/>
+        </w:rPr>
+        <w:t>Decided (2026-09-24): approved.</w:t>
+      </w:r>
+    </w:p>
+    <w:p>
+      <w:r>
+        <w:rPr>
+          <w:b/>
+        </w:rPr>
+        <w:t>R12.2.5 — The pipeline must leave room for the Scanner.</w:t>
+      </w:r>
+      <w:r>
+        <w:rPr>
+          <w:b w:val="0"/>
+        </w:rPr>
+        <w:t xml:space="preserve"> The pipeline and the Scanner share</w:t>
+      </w:r>
+    </w:p>
+    <w:p>
+      <w:r>
+        <w:rPr>
+          <w:b w:val="0"/>
+        </w:rPr>
+        <w:t>one daily LinkedIn budget (75 warn / 99 hard). If the pipeline plans up to the full 99, the user can</w:t>
+      </w:r>
+    </w:p>
+    <w:p>
+      <w:r>
+        <w:rPr>
+          <w:b w:val="0"/>
+        </w:rPr>
+        <w:t>never scan. **The pipeline plans up to the warn line (75), and the band from 75 to 99 is kept for</w:t>
+      </w:r>
+    </w:p>
+    <w:p>
+      <w:r>
+        <w:rPr>
+          <w:b w:val="0"/>
+        </w:rPr>
+        <w:t>the user's own scans.** This answers the budget half of open question 5. The exact split can be</w:t>
+      </w:r>
+    </w:p>
+    <w:p>
+      <w:r>
+        <w:rPr>
+          <w:b w:val="0"/>
+        </w:rPr>
+        <w:t>tuned later, but the pipeline must always leave the Scanner something.</w:t>
+      </w:r>
+    </w:p>
+    <w:p>
+      <w:r>
+        <w:rPr>
+          <w:b/>
+        </w:rPr>
+        <w:t>Decided (2026-09-24): approved.</w:t>
+      </w:r>
+      <w:r>
+        <w:rPr>
+          <w:b w:val="0"/>
+        </w:rPr>
+        <w:t xml:space="preserve"> The 75 is a </w:t>
+      </w:r>
+      <w:r>
+        <w:rPr>
+          <w:b/>
+        </w:rPr>
+        <w:t>ceiling for the pipeline, not a reservation</w:t>
+      </w:r>
+      <w:r>
+        <w:rPr>
+          <w:b w:val="0"/>
+        </w:rPr>
+        <w:t>:</w:t>
+      </w:r>
+    </w:p>
+    <w:p>
+      <w:r>
+        <w:rPr>
+          <w:b w:val="0"/>
+        </w:rPr>
+        <w:t>any touches the pipeline does not use on a given day are free for the Scanner. Heavy pipeline use</w:t>
+      </w:r>
+    </w:p>
+    <w:p>
+      <w:r>
+        <w:rPr>
+          <w:b w:val="0"/>
+        </w:rPr>
+        <w:t>is expected only for the first few days, while the existing accounts are worked through. After</w:t>
+      </w:r>
+    </w:p>
+    <w:p>
+      <w:r>
+        <w:rPr>
+          <w:b w:val="0"/>
+        </w:rPr>
+        <w:t>that, the pipeline only needs touches for new data (imports, Discovery) and for re-verifying fields</w:t>
+      </w:r>
+    </w:p>
+    <w:p>
+      <w:r>
+        <w:rPr>
+          <w:b w:val="0"/>
+        </w:rPr>
+        <w:t>whose verification has expired (R5.3). **In steady state, most of the daily budget goes to the</w:t>
+      </w:r>
+    </w:p>
+    <w:p>
+      <w:r>
+        <w:rPr>
+          <w:b w:val="0"/>
+        </w:rPr>
+        <w:t>Scanner.** The progress line (R12.1.3) should say so when the backlog clears, for example</w:t>
+      </w:r>
+    </w:p>
+    <w:p>
+      <w:r>
+        <w:rPr>
+          <w:b w:val="0"/>
+        </w:rPr>
+        <w:t>*"All accounts processed. Your daily LinkedIn limit is now free for scanning."*</w:t>
+      </w:r>
+    </w:p>
+    <w:p>
+      <w:pPr>
+        <w:pStyle w:val="Heading3"/>
+      </w:pPr>
+      <w:r>
+        <w:rPr>
+          <w:b w:val="0"/>
+        </w:rPr>
+        <w:t>12.3 The first day</w:t>
+      </w:r>
+    </w:p>
+    <w:p>
+      <w:r>
+        <w:rPr>
+          <w:b/>
+        </w:rPr>
+        <w:t>R12.3.1</w:t>
+      </w:r>
+      <w:r>
+        <w:rPr>
+          <w:b w:val="0"/>
+        </w:rPr>
+        <w:t xml:space="preserve"> — The first-day target is </w:t>
+      </w:r>
+      <w:r>
+        <w:rPr>
+          <w:b/>
+        </w:rPr>
+        <w:t>not a fixed number</w:t>
+      </w:r>
+      <w:r>
+        <w:rPr>
+          <w:b w:val="0"/>
+        </w:rPr>
+        <w:t>. It is however many accounts the</w:t>
+      </w:r>
+    </w:p>
+    <w:p>
+      <w:r>
+        <w:rPr>
+          <w:b w:val="0"/>
+        </w:rPr>
+        <w:t xml:space="preserve">day's budget can bring to Ready: </w:t>
+      </w:r>
+      <w:r>
+        <w:rPr>
+          <w:rFonts w:ascii="Consolas" w:hAnsi="Consolas"/>
+          <w:b w:val="0"/>
+        </w:rPr>
+        <w:t>accounts ≈ pipeline budget ÷ touches needed per account</w:t>
+      </w:r>
+      <w:r>
+        <w:rPr>
+          <w:b w:val="0"/>
+        </w:rPr>
+        <w:t>.</w:t>
+      </w:r>
+    </w:p>
+    <w:p>
+      <w:r>
+        <w:rPr>
+          <w:b/>
+        </w:rPr>
+        <w:t>R12.3.2 — Estimate, to be measured in design.</w:t>
+      </w:r>
+      <w:r>
+        <w:rPr>
+          <w:b w:val="0"/>
+        </w:rPr>
+        <w:t xml:space="preserve"> An account that needs everything (resolve its</w:t>
+      </w:r>
+    </w:p>
+    <w:p>
+      <w:r>
+        <w:rPr>
+          <w:b w:val="0"/>
+        </w:rPr>
+        <w:t>LinkedIn id, fetch its size, and a People search for contacts) takes several touches. Accounts</w:t>
+      </w:r>
+    </w:p>
+    <w:p>
+      <w:r>
+        <w:rPr>
+          <w:b w:val="0"/>
+        </w:rPr>
+        <w:t>imported with a LinkedIn link already need fewer. So a realistic first day is likely **tens of</w:t>
+      </w:r>
+    </w:p>
+    <w:p>
+      <w:r>
+        <w:rPr>
+          <w:b w:val="0"/>
+        </w:rPr>
+        <w:t>accounts rather than 100**. The design stage must measure touches per account on real data before</w:t>
+      </w:r>
+    </w:p>
+    <w:p>
+      <w:r>
+        <w:rPr>
+          <w:b w:val="0"/>
+        </w:rPr>
+        <w:t>any number is shown to users.</w:t>
+      </w:r>
+    </w:p>
+    <w:p>
+      <w:r>
+        <w:rPr>
+          <w:b/>
+        </w:rPr>
+        <w:t>R12.3.3</w:t>
+      </w:r>
+      <w:r>
+        <w:rPr>
+          <w:b w:val="0"/>
+        </w:rPr>
+        <w:t xml:space="preserve"> — The first Ready accounts should appear </w:t>
+      </w:r>
+      <w:r>
+        <w:rPr>
+          <w:b/>
+        </w:rPr>
+        <w:t>within the first hour</w:t>
+      </w:r>
+      <w:r>
+        <w:rPr>
+          <w:b w:val="0"/>
+        </w:rPr>
+        <w:t>, not at the end of</w:t>
+      </w:r>
+    </w:p>
+    <w:p>
+      <w:r>
+        <w:rPr>
+          <w:b w:val="0"/>
+        </w:rPr>
+        <w:t>the day. Depth-first order does this naturally: the first account is completed before the second</w:t>
+      </w:r>
+    </w:p>
+    <w:p>
+      <w:r>
+        <w:rPr>
+          <w:b w:val="0"/>
+        </w:rPr>
+        <w:t>is started.</w:t>
+      </w:r>
+    </w:p>
+    <w:p>
+      <w:r>
+        <w:rPr>
+          <w:b/>
+        </w:rPr>
+        <w:t>R12.3.4 — Scanning unlocks early.</w:t>
+      </w:r>
+      <w:r>
+        <w:rPr>
+          <w:b w:val="0"/>
+        </w:rPr>
+        <w:t xml:space="preserve"> The user may start scanning **as soon as a small minimum of</w:t>
+      </w:r>
+    </w:p>
+    <w:p>
+      <w:r>
+        <w:rPr>
+          <w:b w:val="0"/>
+        </w:rPr>
+        <w:t>accounts is Ready**, even on the first day, so they are never left waiting with nothing to do. This</w:t>
+      </w:r>
+    </w:p>
+    <w:p>
+      <w:r>
+        <w:rPr>
+          <w:b w:val="0"/>
+        </w:rPr>
+        <w:t>is the concrete form of R7.4 ("the quality gate must not become a wall"). The minimum is one named</w:t>
+      </w:r>
+    </w:p>
+    <w:p>
+      <w:r>
+        <w:rPr>
+          <w:b w:val="0"/>
+        </w:rPr>
+        <w:t xml:space="preserve">constant, not scattered through the code. </w:t>
+      </w:r>
+      <w:r>
+        <w:rPr>
+          <w:b/>
+        </w:rPr>
+        <w:t>Proposed starting value: 5</w:t>
+      </w:r>
+      <w:r>
+        <w:rPr>
+          <w:b w:val="0"/>
+        </w:rPr>
+        <w:t>, to be tuned once real</w:t>
+      </w:r>
+    </w:p>
+    <w:p>
+      <w:r>
+        <w:rPr>
+          <w:b w:val="0"/>
+        </w:rPr>
+        <w:t>scans show how many posts a small account set actually yields.</w:t>
+      </w:r>
+    </w:p>
+    <w:p>
+      <w:r>
+        <w:rPr>
+          <w:b/>
+        </w:rPr>
+        <w:t>R12.3.5 — Tell the user, never just refuse.</w:t>
+      </w:r>
+      <w:r>
+        <w:rPr>
+          <w:b w:val="0"/>
+        </w:rPr>
+        <w:t xml:space="preserve"> If the user opens the Scanner below the minimum, it</w:t>
+      </w:r>
+    </w:p>
+    <w:p>
+      <w:r>
+        <w:rPr>
+          <w:b w:val="0"/>
+        </w:rPr>
+        <w:t>says so plainly with the numbers and when to expect more: *"You have 3 Ready accounts. The Scanner</w:t>
+      </w:r>
+    </w:p>
+    <w:p>
+      <w:r>
+        <w:rPr>
+          <w:b w:val="0"/>
+        </w:rPr>
+        <w:t>needs at least 5 to start. About 12 more are expected by end of day."*</w:t>
+      </w:r>
+    </w:p>
+    <w:p>
+      <w:pPr>
+        <w:pStyle w:val="Heading3"/>
+      </w:pPr>
+      <w:r>
+        <w:rPr>
+          <w:b w:val="0"/>
+        </w:rPr>
+        <w:t>12.4 When the user is involved</w:t>
+      </w:r>
+    </w:p>
+    <w:p>
+      <w:r>
+        <w:rPr>
+          <w:b w:val="0"/>
+        </w:rPr>
+        <w:t>The user is needed in exactly two places:</w:t>
+      </w:r>
+    </w:p>
+    <w:p>
+      <w:pPr>
+        <w:pStyle w:val="ListNumber"/>
+      </w:pPr>
+      <w:r>
+        <w:rPr>
+          <w:b/>
+        </w:rPr>
+        <w:t>To start it</w:t>
+      </w:r>
+      <w:r>
+        <w:rPr>
+          <w:b w:val="0"/>
+        </w:rPr>
+        <w:t>, once, at the end of onboarding (R12.2.1).</w:t>
+      </w:r>
+    </w:p>
+    <w:p>
+      <w:pPr>
+        <w:pStyle w:val="ListNumber"/>
+      </w:pPr>
+      <w:r>
+        <w:rPr>
+          <w:b/>
+        </w:rPr>
+        <w:t>To decide what only a human can decide</w:t>
+      </w:r>
+      <w:r>
+        <w:rPr>
+          <w:b w:val="0"/>
+        </w:rPr>
+        <w:t>: web-finding conflicts that could change a decision</w:t>
+      </w:r>
+    </w:p>
+    <w:p>
+      <w:r>
+        <w:rPr>
+          <w:b w:val="0"/>
+        </w:rPr>
+        <w:t xml:space="preserve">   (R5.4), the Lacking-evidence review (R12.5), and Discovery companies matched only by name</w:t>
+      </w:r>
+    </w:p>
+    <w:p>
+      <w:r>
+        <w:rPr>
+          <w:b w:val="0"/>
+        </w:rPr>
+        <w:t xml:space="preserve">   (R12.6.3).</w:t>
+      </w:r>
+    </w:p>
+    <w:p>
+      <w:r>
+        <w:rPr>
+          <w:b/>
+        </w:rPr>
+        <w:t>R12.4.1</w:t>
+      </w:r>
+      <w:r>
+        <w:rPr>
+          <w:b w:val="0"/>
+        </w:rPr>
+        <w:t xml:space="preserve"> — When decisions are waiting, the menu item that opens the decision queue carries a</w:t>
+      </w:r>
+    </w:p>
+    <w:p>
+      <w:r>
+        <w:rPr>
+          <w:b/>
+        </w:rPr>
+        <w:t>red dot</w:t>
+      </w:r>
+      <w:r>
+        <w:rPr>
+          <w:b w:val="0"/>
+        </w:rPr>
+        <w:t>. The user does not have to remember to check; the dot tells them. The queue itself is</w:t>
+      </w:r>
+    </w:p>
+    <w:p>
+      <w:r>
+        <w:rPr>
+          <w:b w:val="0"/>
+        </w:rPr>
+        <w:t>next / skip / keep (R6.3.3).</w:t>
+      </w:r>
+    </w:p>
+    <w:p>
+      <w:pPr>
+        <w:pStyle w:val="Heading3"/>
+      </w:pPr>
+      <w:r>
+        <w:rPr>
+          <w:b w:val="0"/>
+        </w:rPr>
+        <w:t>12.5 Accounts the pipeline cannot complete: "Lacking evidence"</w:t>
+      </w:r>
+    </w:p>
+    <w:p>
+      <w:r>
+        <w:rPr>
+          <w:b/>
+        </w:rPr>
+        <w:t>R12.5.1</w:t>
+      </w:r>
+      <w:r>
+        <w:rPr>
+          <w:b w:val="0"/>
+        </w:rPr>
+        <w:t xml:space="preserve"> — An account is </w:t>
+      </w:r>
+      <w:r>
+        <w:rPr>
+          <w:b/>
+        </w:rPr>
+        <w:t>Lacking evidence</w:t>
+      </w:r>
+      <w:r>
+        <w:rPr>
+          <w:b w:val="0"/>
+        </w:rPr>
+        <w:t xml:space="preserve"> when every job that applies to it has been tried</w:t>
+      </w:r>
+    </w:p>
+    <w:p>
+      <w:r>
+        <w:rPr>
+          <w:b w:val="0"/>
+        </w:rPr>
+        <w:t>and it still cannot reach Usable. It stops being retried and gets its own slice in the pie.</w:t>
+      </w:r>
+    </w:p>
+    <w:p>
+      <w:r>
+        <w:rPr>
+          <w:b/>
+        </w:rPr>
+        <w:t>Decided (2026-09-24):</w:t>
+      </w:r>
+      <w:r>
+        <w:rPr>
+          <w:b w:val="0"/>
+        </w:rPr>
+        <w:t xml:space="preserve"> "tried" means </w:t>
+      </w:r>
+      <w:r>
+        <w:rPr>
+          <w:b/>
+        </w:rPr>
+        <w:t>2 attempts on different days</w:t>
+      </w:r>
+      <w:r>
+        <w:rPr>
+          <w:b w:val="0"/>
+        </w:rPr>
+        <w:t>, because a LinkedIn page</w:t>
+      </w:r>
+    </w:p>
+    <w:p>
+      <w:r>
+        <w:rPr>
+          <w:b w:val="0"/>
+        </w:rPr>
+        <w:t>that fails once can simply be a bad moment. The exception is an empty LinkedIn company page</w:t>
+      </w:r>
+    </w:p>
+    <w:p>
+      <w:r>
+        <w:rPr>
+          <w:b w:val="0"/>
+        </w:rPr>
+        <w:t>(R12.5.3), which counts at once.</w:t>
+      </w:r>
+    </w:p>
+    <w:p>
+      <w:r>
+        <w:rPr>
+          <w:b/>
+        </w:rPr>
+        <w:t>R12.5.2</w:t>
+      </w:r>
+      <w:r>
+        <w:rPr>
+          <w:b w:val="0"/>
+        </w:rPr>
+        <w:t xml:space="preserve"> — It is retried only when something new arrives for it: a re-import, a Discovery</w:t>
+      </w:r>
+    </w:p>
+    <w:p>
+      <w:r>
+        <w:rPr>
+          <w:b w:val="0"/>
+        </w:rPr>
+        <w:t>merge, or a manual edit. Otherwise it would consume budget every day with no result.</w:t>
+      </w:r>
+    </w:p>
+    <w:p>
+      <w:r>
+        <w:rPr>
+          <w:b/>
+        </w:rPr>
+        <w:t>R12.5.3 — Fake or empty LinkedIn companies are a known cause.</w:t>
+      </w:r>
+      <w:r>
+        <w:rPr>
+          <w:b w:val="0"/>
+        </w:rPr>
+        <w:t xml:space="preserve"> Some companies on LinkedIn are</w:t>
+      </w:r>
+    </w:p>
+    <w:p>
+      <w:r>
+        <w:rPr>
+          <w:b w:val="0"/>
+        </w:rPr>
+        <w:t>empty shells, with no employees and no content. When the resolver or the size fetch lands on such a</w:t>
+      </w:r>
+    </w:p>
+    <w:p>
+      <w:r>
+        <w:rPr>
+          <w:b w:val="0"/>
+        </w:rPr>
+        <w:t>page, that should itself mark the account as Lacking evidence, with the reason *"LinkedIn page</w:t>
+      </w:r>
+    </w:p>
+    <w:p>
+      <w:r>
+        <w:rPr>
+          <w:b w:val="0"/>
+        </w:rPr>
+        <w:t>looks empty"*, rather than leaving it to fail silently later.</w:t>
+      </w:r>
+    </w:p>
+    <w:p>
+      <w:r>
+        <w:rPr>
+          <w:b/>
+        </w:rPr>
+        <w:t>R12.5.4</w:t>
+      </w:r>
+      <w:r>
+        <w:rPr>
+          <w:b w:val="0"/>
+        </w:rPr>
+        <w:t xml:space="preserve"> — The user reviews these accounts and chooses </w:t>
+      </w:r>
+      <w:r>
+        <w:rPr>
+          <w:b/>
+        </w:rPr>
+        <w:t>Keep</w:t>
+      </w:r>
+      <w:r>
+        <w:rPr>
+          <w:b w:val="0"/>
+        </w:rPr>
+        <w:t xml:space="preserve"> or </w:t>
+      </w:r>
+      <w:r>
+        <w:rPr>
+          <w:b/>
+        </w:rPr>
+        <w:t>Remove</w:t>
+      </w:r>
+      <w:r>
+        <w:rPr>
+          <w:b w:val="0"/>
+        </w:rPr>
+        <w:t>. Remove uses</w:t>
+      </w:r>
+    </w:p>
+    <w:p>
+      <w:r>
+        <w:rPr>
+          <w:b w:val="0"/>
+        </w:rPr>
+        <w:t>the existing soft delete (</w:t>
+      </w:r>
+      <w:r>
+        <w:rPr>
+          <w:rFonts w:ascii="Consolas" w:hAnsi="Consolas"/>
+          <w:b w:val="0"/>
+        </w:rPr>
+        <w:t>deletedAt</w:t>
+      </w:r>
+      <w:r>
+        <w:rPr>
+          <w:b w:val="0"/>
+        </w:rPr>
+        <w:t>), so it can be recovered. Keep means *"leave it, and stop</w:t>
+      </w:r>
+    </w:p>
+    <w:p>
+      <w:r>
+        <w:rPr>
+          <w:b w:val="0"/>
+        </w:rPr>
+        <w:t>retrying"*.</w:t>
+      </w:r>
+    </w:p>
+    <w:p>
+      <w:r>
+        <w:rPr>
+          <w:b/>
+        </w:rPr>
+        <w:t>R12.5.5</w:t>
+      </w:r>
+      <w:r>
+        <w:rPr>
+          <w:b w:val="0"/>
+        </w:rPr>
+        <w:t xml:space="preserve"> — Each account in this state shows </w:t>
+      </w:r>
+      <w:r>
+        <w:rPr>
+          <w:b/>
+        </w:rPr>
+        <w:t>why</w:t>
+      </w:r>
+      <w:r>
+        <w:rPr>
+          <w:b w:val="0"/>
+        </w:rPr>
+        <w:t>: which fields are still missing and what</w:t>
+      </w:r>
+    </w:p>
+    <w:p>
+      <w:r>
+        <w:rPr>
+          <w:b w:val="0"/>
+        </w:rPr>
+        <w:t>was tried. Otherwise the user cannot make an informed Keep / Remove decision.</w:t>
+      </w:r>
+    </w:p>
+    <w:p>
+      <w:pPr>
+        <w:pStyle w:val="Heading3"/>
+      </w:pPr>
+      <w:r>
+        <w:rPr>
+          <w:b w:val="0"/>
+        </w:rPr>
+        <w:t>12.6 Discovery results merge automatically</w:t>
+      </w:r>
+    </w:p>
+    <w:p>
+      <w:r>
+        <w:rPr>
+          <w:b w:val="0"/>
+        </w:rPr>
+        <w:t>Today a Discovery scan leaves its results in a holding area (</w:t>
+      </w:r>
+      <w:r>
+        <w:rPr>
+          <w:rFonts w:ascii="Consolas" w:hAnsi="Consolas"/>
+          <w:b w:val="0"/>
+        </w:rPr>
+        <w:t>discoveredCompanies</w:t>
+      </w:r>
+      <w:r>
+        <w:rPr>
+          <w:b w:val="0"/>
+        </w:rPr>
+        <w:t>), and they reach</w:t>
+      </w:r>
+    </w:p>
+    <w:p>
+      <w:r>
+        <w:rPr>
+          <w:b w:val="0"/>
+        </w:rPr>
+        <w:t xml:space="preserve">the Target Accounts only when the user clicks </w:t>
+      </w:r>
+      <w:r>
+        <w:rPr>
+          <w:b/>
+        </w:rPr>
+        <w:t>Review &amp; Merge Discovery Results</w:t>
+      </w:r>
+      <w:r>
+        <w:rPr>
+          <w:b w:val="0"/>
+        </w:rPr>
+        <w:t xml:space="preserve"> and then **Add</w:t>
+      </w:r>
+    </w:p>
+    <w:p>
+      <w:r>
+        <w:rPr>
+          <w:b w:val="0"/>
+        </w:rPr>
+        <w:t>Them**. That is exactly the pattern this redesign removes: data waiting until the user remembers</w:t>
+      </w:r>
+    </w:p>
+    <w:p>
+      <w:r>
+        <w:rPr>
+          <w:b w:val="0"/>
+        </w:rPr>
+        <w:t>to act.</w:t>
+      </w:r>
+    </w:p>
+    <w:p>
+      <w:r>
+        <w:rPr>
+          <w:b/>
+        </w:rPr>
+        <w:t>R12.6.1</w:t>
+      </w:r>
+      <w:r>
+        <w:rPr>
+          <w:b w:val="0"/>
+        </w:rPr>
+        <w:t xml:space="preserve"> — When a Discovery run finishes, its results are **merged into the Target Accounts</w:t>
+      </w:r>
+    </w:p>
+    <w:p>
+      <w:r>
+        <w:rPr>
+          <w:b w:val="0"/>
+        </w:rPr>
+        <w:t>automatically**, and the pipeline replans (R12.2.2). The holding area stays, so a stopped or redone</w:t>
+      </w:r>
+    </w:p>
+    <w:p>
+      <w:r>
+        <w:rPr>
+          <w:b w:val="0"/>
+        </w:rPr>
+        <w:t>run still never touches committed data. Only a *finished* run is merged.</w:t>
+      </w:r>
+    </w:p>
+    <w:p>
+      <w:r>
+        <w:rPr>
+          <w:b/>
+        </w:rPr>
+        <w:t>R12.6.2 — Why this is safe to do silently.</w:t>
+      </w:r>
+      <w:r>
+        <w:rPr>
+          <w:b w:val="0"/>
+        </w:rPr>
+        <w:t xml:space="preserve"> Discovery results come from the user's own targeting</w:t>
+      </w:r>
+    </w:p>
+    <w:p>
+      <w:r>
+        <w:rPr>
+          <w:b w:val="0"/>
+        </w:rPr>
+        <w:t>settings and arrive with a LinkedIn company id, which is authoritative. Adding an account is</w:t>
+      </w:r>
+    </w:p>
+    <w:p>
+      <w:r>
+        <w:rPr>
+          <w:b w:val="0"/>
+        </w:rPr>
+        <w:t>reversible, because removal is the existing soft delete. It therefore sits in the silent tier</w:t>
+      </w:r>
+    </w:p>
+    <w:p>
+      <w:r>
+        <w:rPr>
+          <w:b w:val="0"/>
+        </w:rPr>
+        <w:t>(R6.2.1): logged, reported in aggregate (*"Discovery added 42 companies and 96 contacts"*), and</w:t>
+      </w:r>
+    </w:p>
+    <w:p>
+      <w:r>
+        <w:rPr>
+          <w:b w:val="0"/>
+        </w:rPr>
+        <w:t>undoable.</w:t>
+      </w:r>
+    </w:p>
+    <w:p>
+      <w:r>
+        <w:rPr>
+          <w:b/>
+        </w:rPr>
+        <w:t>R12.6.3 — Name-only matches go to the decision queue.</w:t>
+      </w:r>
+      <w:r>
+        <w:rPr>
+          <w:b w:val="0"/>
+        </w:rPr>
+        <w:t xml:space="preserve"> A discovered company that matches an</w:t>
+      </w:r>
+    </w:p>
+    <w:p>
+      <w:r>
+        <w:rPr>
+          <w:b w:val="0"/>
+        </w:rPr>
+        <w:t xml:space="preserve">existing account </w:t>
+      </w:r>
+      <w:r>
+        <w:rPr>
+          <w:b/>
+        </w:rPr>
+        <w:t>by LinkedIn id</w:t>
+      </w:r>
+      <w:r>
+        <w:rPr>
+          <w:b w:val="0"/>
+        </w:rPr>
+        <w:t xml:space="preserve"> is merged silently, including the existing free back-fill of</w:t>
+      </w:r>
+    </w:p>
+    <w:p>
+      <w:r>
+        <w:rPr>
+          <w:b w:val="0"/>
+        </w:rPr>
+        <w:t xml:space="preserve">the LinkedIn id. A company that matches an existing account </w:t>
+      </w:r>
+      <w:r>
+        <w:rPr>
+          <w:b/>
+        </w:rPr>
+        <w:t>only by name</w:t>
+      </w:r>
+      <w:r>
+        <w:rPr>
+          <w:b w:val="0"/>
+        </w:rPr>
+        <w:t xml:space="preserve"> is not merged. It goes</w:t>
+      </w:r>
+    </w:p>
+    <w:p>
+      <w:r>
+        <w:rPr>
+          <w:b w:val="0"/>
+        </w:rPr>
+        <w:t>to the decision queue (R12.4, with the red dot), because this is the one case where two different</w:t>
+      </w:r>
+    </w:p>
+    <w:p>
+      <w:r>
+        <w:rPr>
+          <w:b w:val="0"/>
+        </w:rPr>
+        <w:t>companies can be wrongly merged into one.</w:t>
+      </w:r>
+    </w:p>
+    <w:p>
+      <w:r>
+        <w:rPr>
+          <w:b/>
+        </w:rPr>
+        <w:t>R12.6.4</w:t>
+      </w:r>
+      <w:r>
+        <w:rPr>
+          <w:b w:val="0"/>
+        </w:rPr>
+        <w:t xml:space="preserve"> — The </w:t>
+      </w:r>
+      <w:r>
+        <w:rPr>
+          <w:b/>
+        </w:rPr>
+        <w:t>Review &amp; Merge Discovery Results</w:t>
+      </w:r>
+      <w:r>
+        <w:rPr>
+          <w:b w:val="0"/>
+        </w:rPr>
+        <w:t xml:space="preserve"> menu item moves to the support-only Advanced</w:t>
+      </w:r>
+    </w:p>
+    <w:p>
+      <w:r>
+        <w:rPr>
+          <w:b w:val="0"/>
+        </w:rPr>
+        <w:t>tools (R6.2.3).</w:t>
+      </w:r>
+    </w:p>
+    <w:p>
+      <w:pPr>
+        <w:pStyle w:val="Heading3"/>
+      </w:pPr>
+      <w:r>
+        <w:rPr>
+          <w:b w:val="0"/>
+        </w:rPr>
+        <w:t>12.7 Web research runs automatically, within a spending budget</w:t>
+      </w:r>
+    </w:p>
+    <w:p>
+      <w:r>
+        <w:rPr>
+          <w:b/>
+        </w:rPr>
+        <w:t>R12.7.1</w:t>
+      </w:r>
+      <w:r>
+        <w:rPr>
+          <w:b w:val="0"/>
+        </w:rPr>
+        <w:t xml:space="preserve"> — Bulk web research gets </w:t>
+      </w:r>
+      <w:r>
+        <w:rPr>
+          <w:b/>
+        </w:rPr>
+        <w:t>its own standing consent with a spending budget</w:t>
+      </w:r>
+      <w:r>
+        <w:rPr>
+          <w:b w:val="0"/>
+        </w:rPr>
+        <w:t>, separate</w:t>
+      </w:r>
+    </w:p>
+    <w:p>
+      <w:r>
+        <w:rPr>
+          <w:b w:val="0"/>
+        </w:rPr>
+        <w:t>from the LinkedIn consent, because it spends the user's money on their Anthropic API key. Once</w:t>
+      </w:r>
+    </w:p>
+    <w:p>
+      <w:r>
+        <w:rPr>
+          <w:b w:val="0"/>
+        </w:rPr>
+        <w:t>given, the pipeline runs web research automatically, depth-first, like the other jobs.</w:t>
+      </w:r>
+    </w:p>
+    <w:p>
+      <w:r>
+        <w:rPr>
+          <w:b/>
+        </w:rPr>
+        <w:t>R12.7.2</w:t>
+      </w:r>
+      <w:r>
+        <w:rPr>
+          <w:b w:val="0"/>
+        </w:rPr>
+        <w:t xml:space="preserve"> — The budget is set by the user (for example a monthly amount in US$) and is never</w:t>
+      </w:r>
+    </w:p>
+    <w:p>
+      <w:r>
+        <w:rPr>
+          <w:b w:val="0"/>
+        </w:rPr>
+        <w:t>exceeded. The existing web-research cost estimate and the Billing page's API usage are the basis.</w:t>
+      </w:r>
+    </w:p>
+    <w:p>
+      <w:r>
+        <w:rPr>
+          <w:b/>
+        </w:rPr>
+        <w:t>R12.7.3 — Zero or used-up budget is stated, not hidden.</w:t>
+      </w:r>
+      <w:r>
+        <w:rPr>
+          <w:b w:val="0"/>
+        </w:rPr>
+        <w:t xml:space="preserve"> If the budget is zero or used up, web</w:t>
+      </w:r>
+    </w:p>
+    <w:p>
+      <w:r>
+        <w:rPr>
+          <w:b w:val="0"/>
+        </w:rPr>
+        <w:t>research simply does not run, and the user is told so plainly: *"Web research is paused: this</w:t>
+      </w:r>
+    </w:p>
+    <w:p>
+      <w:r>
+        <w:rPr>
+          <w:b w:val="0"/>
+        </w:rPr>
+        <w:t>month's budget of US$20 is used up. Accounts will still be made ready from LinkedIn, but without</w:t>
+      </w:r>
+    </w:p>
+    <w:p>
+      <w:r>
+        <w:rPr>
+          <w:b w:val="0"/>
+        </w:rPr>
+        <w:t>web details. Raise the budget to continue."* Topping up resumes it.</w:t>
+      </w:r>
+    </w:p>
+    <w:p>
+      <w:r>
+        <w:rPr>
+          <w:b/>
+        </w:rPr>
+        <w:t>R12.7.4</w:t>
+      </w:r>
+      <w:r>
+        <w:rPr>
+          <w:b w:val="0"/>
+        </w:rPr>
+        <w:t xml:space="preserve"> — Web research is </w:t>
+      </w:r>
+      <w:r>
+        <w:rPr>
+          <w:b/>
+        </w:rPr>
+        <w:t>not required for Ready</w:t>
+      </w:r>
+      <w:r>
+        <w:rPr>
+          <w:b w:val="0"/>
+        </w:rPr>
+        <w:t xml:space="preserve"> unless it is the only source for a</w:t>
+      </w:r>
+    </w:p>
+    <w:p>
+      <w:r>
+        <w:rPr>
+          <w:b w:val="0"/>
+        </w:rPr>
+        <w:t>mandatory field. LinkedIn provides the identity, size and contacts. So a user with no web budget</w:t>
+      </w:r>
+    </w:p>
+    <w:p>
+      <w:r>
+        <w:rPr>
+          <w:b w:val="0"/>
+        </w:rPr>
+        <w:t>still gets Ready accounts, only with less depth.</w:t>
+      </w:r>
+    </w:p>
+    <w:p>
+      <w:pPr>
+        <w:pStyle w:val="Heading3"/>
+      </w:pPr>
+      <w:r>
+        <w:rPr>
+          <w:b w:val="0"/>
+        </w:rPr>
+        <w:t>12.8 Migration of existing installations</w:t>
+      </w:r>
+    </w:p>
+    <w:p>
+      <w:r>
+        <w:rPr>
+          <w:b/>
+        </w:rPr>
+        <w:t>R12.8.1</w:t>
+      </w:r>
+      <w:r>
+        <w:rPr>
+          <w:b w:val="0"/>
+        </w:rPr>
+        <w:t xml:space="preserve"> — There is </w:t>
+      </w:r>
+      <w:r>
+        <w:rPr>
+          <w:b/>
+        </w:rPr>
+        <w:t>no separate migration step</w:t>
+      </w:r>
+      <w:r>
+        <w:rPr>
+          <w:b w:val="0"/>
+        </w:rPr>
+        <w:t>. On the first run of 1.2.0, every existing</w:t>
+      </w:r>
+    </w:p>
+    <w:p>
+      <w:r>
+        <w:rPr>
+          <w:b w:val="0"/>
+        </w:rPr>
+        <w:t>account is rated against the readiness bar, and the pie shows the result straight away.</w:t>
+      </w:r>
+    </w:p>
+    <w:p>
+      <w:r>
+        <w:rPr>
+          <w:b/>
+        </w:rPr>
+        <w:t>R12.8.2</w:t>
+      </w:r>
+      <w:r>
+        <w:rPr>
+          <w:b w:val="0"/>
+        </w:rPr>
+        <w:t xml:space="preserve"> — Accounts that already qualify are available to the Scanner at once. The pipeline works</w:t>
+      </w:r>
+    </w:p>
+    <w:p>
+      <w:r>
+        <w:rPr>
+          <w:b w:val="0"/>
+        </w:rPr>
+        <w:t>on the rest in the background. The user can keep scanning throughout.</w:t>
+      </w:r>
+    </w:p>
+    <w:p>
+      <w:r>
+        <w:rPr>
+          <w:b/>
+        </w:rPr>
+        <w:t>R12.8.3 — Existing users must still give the consent.</w:t>
+      </w:r>
+      <w:r>
+        <w:rPr>
+          <w:b w:val="0"/>
+        </w:rPr>
+        <w:t xml:space="preserve"> They completed onboarding before the</w:t>
+      </w:r>
+    </w:p>
+    <w:p>
+      <w:r>
+        <w:rPr>
+          <w:b w:val="0"/>
+        </w:rPr>
+        <w:t>standing consent existed (R12.2.1). After the update, they are shown that one consent once. Until</w:t>
+      </w:r>
+    </w:p>
+    <w:p>
+      <w:r>
+        <w:rPr>
+          <w:b w:val="0"/>
+        </w:rPr>
+        <w:t>they give it, nothing runs automatically, and 1.1.x behaviour continues.</w:t>
+      </w:r>
+    </w:p>
+    <w:p>
+      <w:pPr>
+        <w:pStyle w:val="Heading2"/>
+      </w:pPr>
+      <w:r>
+        <w:rPr>
+          <w:b w:val="0"/>
+        </w:rPr>
+        <w:t>Appendix A — Job inventory, as of 1.1.3 (for review)</w:t>
+      </w:r>
+    </w:p>
+    <w:p>
+      <w:r>
+        <w:rPr>
+          <w:b w:val="0"/>
+        </w:rPr>
+        <w:t xml:space="preserve">The *In 1.2.0* column was </w:t>
+      </w:r>
+      <w:r>
+        <w:rPr>
+          <w:b/>
+        </w:rPr>
+        <w:t>agreed on 2026-09-24</w:t>
+      </w:r>
+      <w:r>
+        <w:rPr>
+          <w:b w:val="0"/>
+        </w:rPr>
+        <w:t>.</w:t>
+      </w:r>
+    </w:p>
+    <w:p>
+      <w:pPr>
+        <w:pStyle w:val="Heading3"/>
+      </w:pPr>
+      <w:r>
+        <w:rPr>
+          <w:b w:val="0"/>
+        </w:rPr>
+        <w:t>A.1 Jobs the user triggers</w:t>
+      </w:r>
+    </w:p>
+    <w:tbl>
+      <w:tblPr>
+        <w:tblStyle w:val="TableGrid"/>
+        <w:tblW w:type="auto" w:w="0"/>
+        <w:tblLook w:firstColumn="1" w:firstRow="1" w:lastColumn="0" w:lastRow="0" w:noHBand="0" w:noVBand="1" w:val="04A0"/>
+      </w:tblPr>
+      <w:tblGrid>
+        <w:gridCol w:w="2160"/>
+        <w:gridCol w:w="2160"/>
+        <w:gridCol w:w="2160"/>
+        <w:gridCol w:w="2160"/>
+      </w:tblGrid>
+      <w:tr>
+        <w:tc>
+          <w:tcPr>
+            <w:tcW w:type="dxa" w:w="2160"/>
+          </w:tcPr>
+          <w:p>
+            <w:r/>
+            <w:r>
+              <w:rPr>
+                <w:b/>
+              </w:rPr>
+              <w:t>Job</w:t>
+            </w:r>
+          </w:p>
+        </w:tc>
+        <w:tc>
+          <w:tcPr>
+            <w:tcW w:type="dxa" w:w="2160"/>
+          </w:tcPr>
+          <w:p>
+            <w:r/>
+            <w:r>
+              <w:rPr>
+                <w:b/>
+              </w:rPr>
+              <w:t>Where</w:t>
+            </w:r>
+          </w:p>
+        </w:tc>
+        <w:tc>
+          <w:tcPr>
+            <w:tcW w:type="dxa" w:w="2160"/>
+          </w:tcPr>
+          <w:p>
+            <w:r/>
+            <w:r>
+              <w:rPr>
+                <w:b/>
+              </w:rPr>
+              <w:t>Uses</w:t>
+            </w:r>
+          </w:p>
+        </w:tc>
+        <w:tc>
+          <w:tcPr>
+            <w:tcW w:type="dxa" w:w="2160"/>
+          </w:tcPr>
+          <w:p>
+            <w:r/>
+            <w:r>
+              <w:rPr>
+                <w:b/>
+              </w:rPr>
+              <w:t>In 1.2.0</w:t>
+            </w:r>
+          </w:p>
+        </w:tc>
+      </w:tr>
+      <w:tr>
+        <w:tc>
+          <w:tcPr>
+            <w:tcW w:type="dxa" w:w="2160"/>
+          </w:tcPr>
+          <w:p>
+            <w:r/>
+            <w:r>
+              <w:rPr>
+                <w:b w:val="0"/>
+              </w:rPr>
+              <w:t>Import Research Workbook</w:t>
+            </w:r>
+          </w:p>
+        </w:tc>
+        <w:tc>
+          <w:tcPr>
+            <w:tcW w:type="dxa" w:w="2160"/>
+          </w:tcPr>
+          <w:p>
+            <w:r/>
+            <w:r>
+              <w:rPr>
+                <w:b w:val="0"/>
+              </w:rPr>
+              <w:t>Menu</w:t>
+            </w:r>
+          </w:p>
+        </w:tc>
+        <w:tc>
+          <w:tcPr>
+            <w:tcW w:type="dxa" w:w="2160"/>
+          </w:tcPr>
+          <w:p>
+            <w:r/>
+            <w:r>
+              <w:rPr>
+                <w:b w:val="0"/>
+              </w:rPr>
+              <w:t>—</w:t>
+            </w:r>
+          </w:p>
+        </w:tc>
+        <w:tc>
+          <w:tcPr>
+            <w:tcW w:type="dxa" w:w="2160"/>
+          </w:tcPr>
+          <w:p>
+            <w:r/>
+            <w:r>
+              <w:rPr>
+                <w:b w:val="0"/>
+              </w:rPr>
+              <w:t>Stays user-triggered; triggers a replan</w:t>
+            </w:r>
+          </w:p>
+        </w:tc>
+      </w:tr>
+      <w:tr>
+        <w:tc>
+          <w:tcPr>
+            <w:tcW w:type="dxa" w:w="2160"/>
+          </w:tcPr>
+          <w:p>
+            <w:r/>
+            <w:r>
+              <w:rPr>
+                <w:b w:val="0"/>
+              </w:rPr>
+              <w:t>Import from HubSpot</w:t>
+            </w:r>
+          </w:p>
+        </w:tc>
+        <w:tc>
+          <w:tcPr>
+            <w:tcW w:type="dxa" w:w="2160"/>
+          </w:tcPr>
+          <w:p>
+            <w:r/>
+            <w:r>
+              <w:rPr>
+                <w:b w:val="0"/>
+              </w:rPr>
+              <w:t>Menu</w:t>
+            </w:r>
+          </w:p>
+        </w:tc>
+        <w:tc>
+          <w:tcPr>
+            <w:tcW w:type="dxa" w:w="2160"/>
+          </w:tcPr>
+          <w:p>
+            <w:r/>
+            <w:r>
+              <w:rPr>
+                <w:b w:val="0"/>
+              </w:rPr>
+              <w:t>—</w:t>
+            </w:r>
+          </w:p>
+        </w:tc>
+        <w:tc>
+          <w:tcPr>
+            <w:tcW w:type="dxa" w:w="2160"/>
+          </w:tcPr>
+          <w:p>
+            <w:r/>
+            <w:r>
+              <w:rPr>
+                <w:b w:val="0"/>
+              </w:rPr>
+              <w:t>Stays user-triggered; triggers a replan</w:t>
+            </w:r>
+          </w:p>
+        </w:tc>
+      </w:tr>
+      <w:tr>
+        <w:tc>
+          <w:tcPr>
+            <w:tcW w:type="dxa" w:w="2160"/>
+          </w:tcPr>
+          <w:p>
+            <w:r/>
+            <w:r>
+              <w:rPr>
+                <w:b w:val="0"/>
+              </w:rPr>
+              <w:t>Restore Accounts &amp; Contacts from Backup</w:t>
+            </w:r>
+          </w:p>
+        </w:tc>
+        <w:tc>
+          <w:tcPr>
+            <w:tcW w:type="dxa" w:w="2160"/>
+          </w:tcPr>
+          <w:p>
+            <w:r/>
+            <w:r>
+              <w:rPr>
+                <w:b w:val="0"/>
+              </w:rPr>
+              <w:t>Menu</w:t>
+            </w:r>
+          </w:p>
+        </w:tc>
+        <w:tc>
+          <w:tcPr>
+            <w:tcW w:type="dxa" w:w="2160"/>
+          </w:tcPr>
+          <w:p>
+            <w:r/>
+            <w:r>
+              <w:rPr>
+                <w:b w:val="0"/>
+              </w:rPr>
+              <w:t>—</w:t>
+            </w:r>
+          </w:p>
+        </w:tc>
+        <w:tc>
+          <w:tcPr>
+            <w:tcW w:type="dxa" w:w="2160"/>
+          </w:tcPr>
+          <w:p>
+            <w:r/>
+            <w:r>
+              <w:rPr>
+                <w:b w:val="0"/>
+              </w:rPr>
+              <w:t>Stays user-triggered</w:t>
+            </w:r>
+          </w:p>
+        </w:tc>
+      </w:tr>
+      <w:tr>
+        <w:tc>
+          <w:tcPr>
+            <w:tcW w:type="dxa" w:w="2160"/>
+          </w:tcPr>
+          <w:p>
+            <w:r/>
+            <w:r>
+              <w:rPr>
+                <w:b w:val="0"/>
+              </w:rPr>
+              <w:t>Discovery of companies and contacts (Setup wizard, incl. Continue Discovery Scan)</w:t>
+            </w:r>
+          </w:p>
+        </w:tc>
+        <w:tc>
+          <w:tcPr>
+            <w:tcW w:type="dxa" w:w="2160"/>
+          </w:tcPr>
+          <w:p>
+            <w:r/>
+            <w:r>
+              <w:rPr>
+                <w:b w:val="0"/>
+              </w:rPr>
+              <w:t>Wizard</w:t>
+            </w:r>
+          </w:p>
+        </w:tc>
+        <w:tc>
+          <w:tcPr>
+            <w:tcW w:type="dxa" w:w="2160"/>
+          </w:tcPr>
+          <w:p>
+            <w:r/>
+            <w:r>
+              <w:rPr>
+                <w:b w:val="0"/>
+              </w:rPr>
+              <w:t>LinkedIn</w:t>
+            </w:r>
+          </w:p>
+        </w:tc>
+        <w:tc>
+          <w:tcPr>
+            <w:tcW w:type="dxa" w:w="2160"/>
+          </w:tcPr>
+          <w:p>
+            <w:r/>
+            <w:r>
+              <w:rPr>
+                <w:b w:val="0"/>
+              </w:rPr>
+              <w:t>Stays user-triggered (a source)</w:t>
+            </w:r>
+          </w:p>
+        </w:tc>
+      </w:tr>
+      <w:tr>
+        <w:tc>
+          <w:tcPr>
+            <w:tcW w:type="dxa" w:w="2160"/>
+          </w:tcPr>
+          <w:p>
+            <w:r/>
+            <w:r>
+              <w:rPr>
+                <w:b w:val="0"/>
+              </w:rPr>
+              <w:t>Review &amp; Merge Discovery Results</w:t>
+            </w:r>
+          </w:p>
+        </w:tc>
+        <w:tc>
+          <w:tcPr>
+            <w:tcW w:type="dxa" w:w="2160"/>
+          </w:tcPr>
+          <w:p>
+            <w:r/>
+            <w:r>
+              <w:rPr>
+                <w:b w:val="0"/>
+              </w:rPr>
+              <w:t>Menu</w:t>
+            </w:r>
+          </w:p>
+        </w:tc>
+        <w:tc>
+          <w:tcPr>
+            <w:tcW w:type="dxa" w:w="2160"/>
+          </w:tcPr>
+          <w:p>
+            <w:r/>
+            <w:r>
+              <w:rPr>
+                <w:b w:val="0"/>
+              </w:rPr>
+              <w:t>—</w:t>
+            </w:r>
+          </w:p>
+        </w:tc>
+        <w:tc>
+          <w:tcPr>
+            <w:tcW w:type="dxa" w:w="2160"/>
+          </w:tcPr>
+          <w:p>
+            <w:r/>
+            <w:r>
+              <w:rPr>
+                <w:b/>
+              </w:rPr>
+              <w:t>Automatic</w:t>
+            </w:r>
+            <w:r>
+              <w:rPr>
+                <w:b w:val="0"/>
+              </w:rPr>
+              <w:t xml:space="preserve"> when a Discovery run finishes, then replans; name-only matches go to the decision queue; menu item becomes support-only (R12.6)</w:t>
+            </w:r>
+          </w:p>
+        </w:tc>
+      </w:tr>
+      <w:tr>
+        <w:tc>
+          <w:tcPr>
+            <w:tcW w:type="dxa" w:w="2160"/>
+          </w:tcPr>
+          <w:p>
+            <w:r/>
+            <w:r>
+              <w:rPr>
+                <w:b w:val="0"/>
+              </w:rPr>
+              <w:t>Discover Contacts for Existing Companies</w:t>
+            </w:r>
+          </w:p>
+        </w:tc>
+        <w:tc>
+          <w:tcPr>
+            <w:tcW w:type="dxa" w:w="2160"/>
+          </w:tcPr>
+          <w:p>
+            <w:r/>
+            <w:r>
+              <w:rPr>
+                <w:b w:val="0"/>
+              </w:rPr>
+              <w:t>Menu</w:t>
+            </w:r>
+          </w:p>
+        </w:tc>
+        <w:tc>
+          <w:tcPr>
+            <w:tcW w:type="dxa" w:w="2160"/>
+          </w:tcPr>
+          <w:p>
+            <w:r/>
+            <w:r>
+              <w:rPr>
+                <w:b w:val="0"/>
+              </w:rPr>
+              <w:t>LinkedIn</w:t>
+            </w:r>
+          </w:p>
+        </w:tc>
+        <w:tc>
+          <w:tcPr>
+            <w:tcW w:type="dxa" w:w="2160"/>
+          </w:tcPr>
+          <w:p>
+            <w:r/>
+            <w:r>
+              <w:rPr>
+                <w:b/>
+              </w:rPr>
+              <w:t>Automatic</w:t>
+            </w:r>
+          </w:p>
+        </w:tc>
+      </w:tr>
+      <w:tr>
+        <w:tc>
+          <w:tcPr>
+            <w:tcW w:type="dxa" w:w="2160"/>
+          </w:tcPr>
+          <w:p>
+            <w:r/>
+            <w:r>
+              <w:rPr>
+                <w:b w:val="0"/>
+              </w:rPr>
+              <w:t>Resolve LinkedIn Company IDs</w:t>
+            </w:r>
+          </w:p>
+        </w:tc>
+        <w:tc>
+          <w:tcPr>
+            <w:tcW w:type="dxa" w:w="2160"/>
+          </w:tcPr>
+          <w:p>
+            <w:r/>
+            <w:r>
+              <w:rPr>
+                <w:b w:val="0"/>
+              </w:rPr>
+              <w:t>Advanced</w:t>
+            </w:r>
+          </w:p>
+        </w:tc>
+        <w:tc>
+          <w:tcPr>
+            <w:tcW w:type="dxa" w:w="2160"/>
+          </w:tcPr>
+          <w:p>
+            <w:r/>
+            <w:r>
+              <w:rPr>
+                <w:b w:val="0"/>
+              </w:rPr>
+              <w:t>LinkedIn</w:t>
+            </w:r>
+          </w:p>
+        </w:tc>
+        <w:tc>
+          <w:tcPr>
+            <w:tcW w:type="dxa" w:w="2160"/>
+          </w:tcPr>
+          <w:p>
+            <w:r/>
+            <w:r>
+              <w:rPr>
+                <w:b/>
+              </w:rPr>
+              <w:t>Automatic</w:t>
+            </w:r>
+          </w:p>
+        </w:tc>
+      </w:tr>
+      <w:tr>
+        <w:tc>
+          <w:tcPr>
+            <w:tcW w:type="dxa" w:w="2160"/>
+          </w:tcPr>
+          <w:p>
+            <w:r/>
+            <w:r>
+              <w:rPr>
+                <w:b w:val="0"/>
+              </w:rPr>
+              <w:t>Fetch Company Size</w:t>
+            </w:r>
+          </w:p>
+        </w:tc>
+        <w:tc>
+          <w:tcPr>
+            <w:tcW w:type="dxa" w:w="2160"/>
+          </w:tcPr>
+          <w:p>
+            <w:r/>
+            <w:r>
+              <w:rPr>
+                <w:b w:val="0"/>
+              </w:rPr>
+              <w:t>Advanced</w:t>
+            </w:r>
+          </w:p>
+        </w:tc>
+        <w:tc>
+          <w:tcPr>
+            <w:tcW w:type="dxa" w:w="2160"/>
+          </w:tcPr>
+          <w:p>
+            <w:r/>
+            <w:r>
+              <w:rPr>
+                <w:b w:val="0"/>
+              </w:rPr>
+              <w:t>LinkedIn</w:t>
+            </w:r>
+          </w:p>
+        </w:tc>
+        <w:tc>
+          <w:tcPr>
+            <w:tcW w:type="dxa" w:w="2160"/>
+          </w:tcPr>
+          <w:p>
+            <w:r/>
+            <w:r>
+              <w:rPr>
+                <w:b/>
+              </w:rPr>
+              <w:t>Automatic</w:t>
+            </w:r>
+          </w:p>
+        </w:tc>
+      </w:tr>
+      <w:tr>
+        <w:tc>
+          <w:tcPr>
+            <w:tcW w:type="dxa" w:w="2160"/>
+          </w:tcPr>
+          <w:p>
+            <w:r/>
+            <w:r>
+              <w:rPr>
+                <w:b w:val="0"/>
+              </w:rPr>
+              <w:t>Find &amp; Merge Duplicates</w:t>
+            </w:r>
+          </w:p>
+        </w:tc>
+        <w:tc>
+          <w:tcPr>
+            <w:tcW w:type="dxa" w:w="2160"/>
+          </w:tcPr>
+          <w:p>
+            <w:r/>
+            <w:r>
+              <w:rPr>
+                <w:b w:val="0"/>
+              </w:rPr>
+              <w:t>Advanced</w:t>
+            </w:r>
+          </w:p>
+        </w:tc>
+        <w:tc>
+          <w:tcPr>
+            <w:tcW w:type="dxa" w:w="2160"/>
+          </w:tcPr>
+          <w:p>
+            <w:r/>
+            <w:r>
+              <w:rPr>
+                <w:b w:val="0"/>
+              </w:rPr>
+              <w:t>—</w:t>
+            </w:r>
+          </w:p>
+        </w:tc>
+        <w:tc>
+          <w:tcPr>
+            <w:tcW w:type="dxa" w:w="2160"/>
+          </w:tcPr>
+          <w:p>
+            <w:r/>
+            <w:r>
+              <w:rPr>
+                <w:b/>
+              </w:rPr>
+              <w:t>Automatic</w:t>
+            </w:r>
+            <w:r>
+              <w:rPr>
+                <w:b w:val="0"/>
+              </w:rPr>
+              <w:t xml:space="preserve"> for duplicates that can be settled safely; only those that cannot go to the decision queue for the user</w:t>
+            </w:r>
+          </w:p>
+        </w:tc>
+      </w:tr>
+      <w:tr>
+        <w:tc>
+          <w:tcPr>
+            <w:tcW w:type="dxa" w:w="2160"/>
+          </w:tcPr>
+          <w:p>
+            <w:r/>
+            <w:r>
+              <w:rPr>
+                <w:b w:val="0"/>
+              </w:rPr>
+              <w:t>Prioritize Companies</w:t>
+            </w:r>
+          </w:p>
+        </w:tc>
+        <w:tc>
+          <w:tcPr>
+            <w:tcW w:type="dxa" w:w="2160"/>
+          </w:tcPr>
+          <w:p>
+            <w:r/>
+            <w:r>
+              <w:rPr>
+                <w:b w:val="0"/>
+              </w:rPr>
+              <w:t>Advanced</w:t>
+            </w:r>
+          </w:p>
+        </w:tc>
+        <w:tc>
+          <w:tcPr>
+            <w:tcW w:type="dxa" w:w="2160"/>
+          </w:tcPr>
+          <w:p>
+            <w:r/>
+            <w:r>
+              <w:rPr>
+                <w:b w:val="0"/>
+              </w:rPr>
+              <w:t>AI (API)</w:t>
+            </w:r>
+          </w:p>
+        </w:tc>
+        <w:tc>
+          <w:tcPr>
+            <w:tcW w:type="dxa" w:w="2160"/>
+          </w:tcPr>
+          <w:p>
+            <w:r/>
+            <w:r>
+              <w:rPr>
+                <w:b/>
+              </w:rPr>
+              <w:t>Automatic</w:t>
+            </w:r>
+          </w:p>
+        </w:tc>
+      </w:tr>
+      <w:tr>
+        <w:tc>
+          <w:tcPr>
+            <w:tcW w:type="dxa" w:w="2160"/>
+          </w:tcPr>
+          <w:p>
+            <w:r/>
+            <w:r>
+              <w:rPr>
+                <w:b w:val="0"/>
+              </w:rPr>
+              <w:t>Research Accounts on the Web (bulk)</w:t>
+            </w:r>
+          </w:p>
+        </w:tc>
+        <w:tc>
+          <w:tcPr>
+            <w:tcW w:type="dxa" w:w="2160"/>
+          </w:tcPr>
+          <w:p>
+            <w:r/>
+            <w:r>
+              <w:rPr>
+                <w:b w:val="0"/>
+              </w:rPr>
+              <w:t>Menu</w:t>
+            </w:r>
+          </w:p>
+        </w:tc>
+        <w:tc>
+          <w:tcPr>
+            <w:tcW w:type="dxa" w:w="2160"/>
+          </w:tcPr>
+          <w:p>
+            <w:r/>
+            <w:r>
+              <w:rPr>
+                <w:b w:val="0"/>
+              </w:rPr>
+              <w:t>US$ (API)</w:t>
+            </w:r>
+          </w:p>
+        </w:tc>
+        <w:tc>
+          <w:tcPr>
+            <w:tcW w:type="dxa" w:w="2160"/>
+          </w:tcPr>
+          <w:p>
+            <w:r/>
+            <w:r>
+              <w:rPr>
+                <w:b/>
+              </w:rPr>
+              <w:t>Automatic within its own spending budget</w:t>
+            </w:r>
+            <w:r>
+              <w:rPr>
+                <w:b w:val="0"/>
+              </w:rPr>
+              <w:t xml:space="preserve"> (R12.7); paused and stated when the budget is zero or used up</w:t>
+            </w:r>
+          </w:p>
+        </w:tc>
+      </w:tr>
+      <w:tr>
+        <w:tc>
+          <w:tcPr>
+            <w:tcW w:type="dxa" w:w="2160"/>
+          </w:tcPr>
+          <w:p>
+            <w:r/>
+            <w:r>
+              <w:rPr>
+                <w:b w:val="0"/>
+              </w:rPr>
+              <w:t>Research this account on the web</w:t>
+            </w:r>
+          </w:p>
+        </w:tc>
+        <w:tc>
+          <w:tcPr>
+            <w:tcW w:type="dxa" w:w="2160"/>
+          </w:tcPr>
+          <w:p>
+            <w:r/>
+            <w:r>
+              <w:rPr>
+                <w:b w:val="0"/>
+              </w:rPr>
+              <w:t>Account page</w:t>
+            </w:r>
+          </w:p>
+        </w:tc>
+        <w:tc>
+          <w:tcPr>
+            <w:tcW w:type="dxa" w:w="2160"/>
+          </w:tcPr>
+          <w:p>
+            <w:r/>
+            <w:r>
+              <w:rPr>
+                <w:b w:val="0"/>
+              </w:rPr>
+              <w:t>US$ (API)</w:t>
+            </w:r>
+          </w:p>
+        </w:tc>
+        <w:tc>
+          <w:tcPr>
+            <w:tcW w:type="dxa" w:w="2160"/>
+          </w:tcPr>
+          <w:p>
+            <w:r/>
+            <w:r>
+              <w:rPr>
+                <w:b w:val="0"/>
+              </w:rPr>
+              <w:t>Stays user-triggered</w:t>
+            </w:r>
+          </w:p>
+        </w:tc>
+      </w:tr>
+      <w:tr>
+        <w:tc>
+          <w:tcPr>
+            <w:tcW w:type="dxa" w:w="2160"/>
+          </w:tcPr>
+          <w:p>
+            <w:r/>
+            <w:r>
+              <w:rPr>
+                <w:b w:val="0"/>
+              </w:rPr>
+              <w:t>Resolve Web Findings Automatically</w:t>
+            </w:r>
+          </w:p>
+        </w:tc>
+        <w:tc>
+          <w:tcPr>
+            <w:tcW w:type="dxa" w:w="2160"/>
+          </w:tcPr>
+          <w:p>
+            <w:r/>
+            <w:r>
+              <w:rPr>
+                <w:b w:val="0"/>
+              </w:rPr>
+              <w:t>Menu</w:t>
+            </w:r>
+          </w:p>
+        </w:tc>
+        <w:tc>
+          <w:tcPr>
+            <w:tcW w:type="dxa" w:w="2160"/>
+          </w:tcPr>
+          <w:p>
+            <w:r/>
+            <w:r>
+              <w:rPr>
+                <w:b w:val="0"/>
+              </w:rPr>
+              <w:t>—</w:t>
+            </w:r>
+          </w:p>
+        </w:tc>
+        <w:tc>
+          <w:tcPr>
+            <w:tcW w:type="dxa" w:w="2160"/>
+          </w:tcPr>
+          <w:p>
+            <w:r/>
+            <w:r>
+              <w:rPr>
+                <w:b/>
+              </w:rPr>
+              <w:t>Automatic (silent tier)</w:t>
+            </w:r>
+          </w:p>
+        </w:tc>
+      </w:tr>
+      <w:tr>
+        <w:tc>
+          <w:tcPr>
+            <w:tcW w:type="dxa" w:w="2160"/>
+          </w:tcPr>
+          <w:p>
+            <w:r/>
+            <w:r>
+              <w:rPr>
+                <w:b w:val="0"/>
+              </w:rPr>
+              <w:t>Review findings</w:t>
+            </w:r>
+          </w:p>
+        </w:tc>
+        <w:tc>
+          <w:tcPr>
+            <w:tcW w:type="dxa" w:w="2160"/>
+          </w:tcPr>
+          <w:p>
+            <w:r/>
+            <w:r>
+              <w:rPr>
+                <w:b w:val="0"/>
+              </w:rPr>
+              <w:t>Account page</w:t>
+            </w:r>
+          </w:p>
+        </w:tc>
+        <w:tc>
+          <w:tcPr>
+            <w:tcW w:type="dxa" w:w="2160"/>
+          </w:tcPr>
+          <w:p>
+            <w:r/>
+            <w:r>
+              <w:rPr>
+                <w:b w:val="0"/>
+              </w:rPr>
+              <w:t>—</w:t>
+            </w:r>
+          </w:p>
+        </w:tc>
+        <w:tc>
+          <w:tcPr>
+            <w:tcW w:type="dxa" w:w="2160"/>
+          </w:tcPr>
+          <w:p>
+            <w:r/>
+            <w:r>
+              <w:rPr>
+                <w:b w:val="0"/>
+              </w:rPr>
+              <w:t>Moves into the decision queue</w:t>
+            </w:r>
+          </w:p>
+        </w:tc>
+      </w:tr>
+      <w:tr>
+        <w:tc>
+          <w:tcPr>
+            <w:tcW w:type="dxa" w:w="2160"/>
+          </w:tcPr>
+          <w:p>
+            <w:r/>
+            <w:r>
+              <w:rPr>
+                <w:b w:val="0"/>
+              </w:rPr>
+              <w:t>Extract Companies</w:t>
+            </w:r>
+          </w:p>
+        </w:tc>
+        <w:tc>
+          <w:tcPr>
+            <w:tcW w:type="dxa" w:w="2160"/>
+          </w:tcPr>
+          <w:p>
+            <w:r/>
+            <w:r>
+              <w:rPr>
+                <w:b w:val="0"/>
+              </w:rPr>
+              <w:t>Advanced</w:t>
+            </w:r>
+          </w:p>
+        </w:tc>
+        <w:tc>
+          <w:tcPr>
+            <w:tcW w:type="dxa" w:w="2160"/>
+          </w:tcPr>
+          <w:p>
+            <w:r/>
+            <w:r>
+              <w:rPr>
+                <w:b w:val="0"/>
+              </w:rPr>
+              <w:t>AI (API)</w:t>
+            </w:r>
+          </w:p>
+        </w:tc>
+        <w:tc>
+          <w:tcPr>
+            <w:tcW w:type="dxa" w:w="2160"/>
+          </w:tcPr>
+          <w:p>
+            <w:r/>
+            <w:r>
+              <w:rPr>
+                <w:b w:val="0"/>
+              </w:rPr>
+              <w:t>Automatic (already runs during every scan)</w:t>
+            </w:r>
+          </w:p>
+        </w:tc>
+      </w:tr>
+      <w:tr>
+        <w:tc>
+          <w:tcPr>
+            <w:tcW w:type="dxa" w:w="2160"/>
+          </w:tcPr>
+          <w:p>
+            <w:r/>
+            <w:r>
+              <w:rPr>
+                <w:b w:val="0"/>
+              </w:rPr>
+              <w:t>Extract Companies &amp; Locations from Profiles</w:t>
+            </w:r>
+          </w:p>
+        </w:tc>
+        <w:tc>
+          <w:tcPr>
+            <w:tcW w:type="dxa" w:w="2160"/>
+          </w:tcPr>
+          <w:p>
+            <w:r/>
+            <w:r>
+              <w:rPr>
+                <w:b w:val="0"/>
+              </w:rPr>
+              <w:t>Advanced</w:t>
+            </w:r>
+          </w:p>
+        </w:tc>
+        <w:tc>
+          <w:tcPr>
+            <w:tcW w:type="dxa" w:w="2160"/>
+          </w:tcPr>
+          <w:p>
+            <w:r/>
+            <w:r>
+              <w:rPr>
+                <w:b w:val="0"/>
+              </w:rPr>
+              <w:t>LinkedIn</w:t>
+            </w:r>
+          </w:p>
+        </w:tc>
+        <w:tc>
+          <w:tcPr>
+            <w:tcW w:type="dxa" w:w="2160"/>
+          </w:tcPr>
+          <w:p>
+            <w:r/>
+            <w:r>
+              <w:rPr>
+                <w:b w:val="0"/>
+              </w:rPr>
+              <w:t>Automatic, depth-first, within budget</w:t>
+            </w:r>
+          </w:p>
+        </w:tc>
+      </w:tr>
+      <w:tr>
+        <w:tc>
+          <w:tcPr>
+            <w:tcW w:type="dxa" w:w="2160"/>
+          </w:tcPr>
+          <w:p>
+            <w:r/>
+            <w:r>
+              <w:rPr>
+                <w:b w:val="0"/>
+              </w:rPr>
+              <w:t>Prioritize Unscored Leads</w:t>
+            </w:r>
+          </w:p>
+        </w:tc>
+        <w:tc>
+          <w:tcPr>
+            <w:tcW w:type="dxa" w:w="2160"/>
+          </w:tcPr>
+          <w:p>
+            <w:r/>
+            <w:r>
+              <w:rPr>
+                <w:b w:val="0"/>
+              </w:rPr>
+              <w:t>Advanced</w:t>
+            </w:r>
+          </w:p>
+        </w:tc>
+        <w:tc>
+          <w:tcPr>
+            <w:tcW w:type="dxa" w:w="2160"/>
+          </w:tcPr>
+          <w:p>
+            <w:r/>
+            <w:r>
+              <w:rPr>
+                <w:b w:val="0"/>
+              </w:rPr>
+              <w:t>AI (API)</w:t>
+            </w:r>
+          </w:p>
+        </w:tc>
+        <w:tc>
+          <w:tcPr>
+            <w:tcW w:type="dxa" w:w="2160"/>
+          </w:tcPr>
+          <w:p>
+            <w:r/>
+            <w:r>
+              <w:rPr>
+                <w:b w:val="0"/>
+              </w:rPr>
+              <w:t>Automatic (already runs during every scan)</w:t>
+            </w:r>
+          </w:p>
+        </w:tc>
+      </w:tr>
+      <w:tr>
+        <w:tc>
+          <w:tcPr>
+            <w:tcW w:type="dxa" w:w="2160"/>
+          </w:tcPr>
+          <w:p>
+            <w:r/>
+            <w:r>
+              <w:rPr>
+                <w:b w:val="0"/>
+              </w:rPr>
+              <w:t>Re-score All Priorities</w:t>
+            </w:r>
+          </w:p>
+        </w:tc>
+        <w:tc>
+          <w:tcPr>
+            <w:tcW w:type="dxa" w:w="2160"/>
+          </w:tcPr>
+          <w:p>
+            <w:r/>
+            <w:r>
+              <w:rPr>
+                <w:b w:val="0"/>
+              </w:rPr>
+              <w:t>Advanced</w:t>
+            </w:r>
+          </w:p>
+        </w:tc>
+        <w:tc>
+          <w:tcPr>
+            <w:tcW w:type="dxa" w:w="2160"/>
+          </w:tcPr>
+          <w:p>
+            <w:r/>
+            <w:r>
+              <w:rPr>
+                <w:b w:val="0"/>
+              </w:rPr>
+              <w:t>AI (API)</w:t>
+            </w:r>
+          </w:p>
+        </w:tc>
+        <w:tc>
+          <w:tcPr>
+            <w:tcW w:type="dxa" w:w="2160"/>
+          </w:tcPr>
+          <w:p>
+            <w:r/>
+            <w:r>
+              <w:rPr>
+                <w:b w:val="0"/>
+              </w:rPr>
+              <w:t>Automatic when targeting settings change; support-only otherwise</w:t>
+            </w:r>
+          </w:p>
+        </w:tc>
+      </w:tr>
+      <w:tr>
+        <w:tc>
+          <w:tcPr>
+            <w:tcW w:type="dxa" w:w="2160"/>
+          </w:tcPr>
+          <w:p>
+            <w:r/>
+            <w:r>
+              <w:rPr>
+                <w:b w:val="0"/>
+              </w:rPr>
+              <w:t>Apply Location Filter</w:t>
+            </w:r>
+          </w:p>
+        </w:tc>
+        <w:tc>
+          <w:tcPr>
+            <w:tcW w:type="dxa" w:w="2160"/>
+          </w:tcPr>
+          <w:p>
+            <w:r/>
+            <w:r>
+              <w:rPr>
+                <w:b w:val="0"/>
+              </w:rPr>
+              <w:t>Advanced</w:t>
+            </w:r>
+          </w:p>
+        </w:tc>
+        <w:tc>
+          <w:tcPr>
+            <w:tcW w:type="dxa" w:w="2160"/>
+          </w:tcPr>
+          <w:p>
+            <w:r/>
+            <w:r>
+              <w:rPr>
+                <w:b w:val="0"/>
+              </w:rPr>
+              <w:t>—</w:t>
+            </w:r>
+          </w:p>
+        </w:tc>
+        <w:tc>
+          <w:tcPr>
+            <w:tcW w:type="dxa" w:w="2160"/>
+          </w:tcPr>
+          <w:p>
+            <w:r/>
+            <w:r>
+              <w:rPr>
+                <w:b w:val="0"/>
+              </w:rPr>
+              <w:t>Automatic when the location setting changes</w:t>
+            </w:r>
+          </w:p>
+        </w:tc>
+      </w:tr>
+      <w:tr>
+        <w:tc>
+          <w:tcPr>
+            <w:tcW w:type="dxa" w:w="2160"/>
+          </w:tcPr>
+          <w:p>
+            <w:r/>
+            <w:r>
+              <w:rPr>
+                <w:b w:val="0"/>
+              </w:rPr>
+              <w:t>Scanner scan</w:t>
+            </w:r>
+          </w:p>
+        </w:tc>
+        <w:tc>
+          <w:tcPr>
+            <w:tcW w:type="dxa" w:w="2160"/>
+          </w:tcPr>
+          <w:p>
+            <w:r/>
+            <w:r>
+              <w:rPr>
+                <w:b w:val="0"/>
+              </w:rPr>
+              <w:t>Scanner</w:t>
+            </w:r>
+          </w:p>
+        </w:tc>
+        <w:tc>
+          <w:tcPr>
+            <w:tcW w:type="dxa" w:w="2160"/>
+          </w:tcPr>
+          <w:p>
+            <w:r/>
+            <w:r>
+              <w:rPr>
+                <w:b w:val="0"/>
+              </w:rPr>
+              <w:t>LinkedIn</w:t>
+            </w:r>
+          </w:p>
+        </w:tc>
+        <w:tc>
+          <w:tcPr>
+            <w:tcW w:type="dxa" w:w="2160"/>
+          </w:tcPr>
+          <w:p>
+            <w:r/>
+            <w:r>
+              <w:rPr>
+                <w:b w:val="0"/>
+              </w:rPr>
+              <w:t>Stays user-triggered: this is the product</w:t>
+            </w:r>
+          </w:p>
+        </w:tc>
+      </w:tr>
+      <w:tr>
+        <w:tc>
+          <w:tcPr>
+            <w:tcW w:type="dxa" w:w="2160"/>
+          </w:tcPr>
+          <w:p>
+            <w:r/>
+            <w:r>
+              <w:rPr>
+                <w:b w:val="0"/>
+              </w:rPr>
+              <w:t>Bulk edit, Remove account</w:t>
+            </w:r>
+          </w:p>
+        </w:tc>
+        <w:tc>
+          <w:tcPr>
+            <w:tcW w:type="dxa" w:w="2160"/>
+          </w:tcPr>
+          <w:p>
+            <w:r/>
+            <w:r>
+              <w:rPr>
+                <w:b w:val="0"/>
+              </w:rPr>
+              <w:t>Tables</w:t>
+            </w:r>
+          </w:p>
+        </w:tc>
+        <w:tc>
+          <w:tcPr>
+            <w:tcW w:type="dxa" w:w="2160"/>
+          </w:tcPr>
+          <w:p>
+            <w:r/>
+            <w:r>
+              <w:rPr>
+                <w:b w:val="0"/>
+              </w:rPr>
+              <w:t>—</w:t>
+            </w:r>
+          </w:p>
+        </w:tc>
+        <w:tc>
+          <w:tcPr>
+            <w:tcW w:type="dxa" w:w="2160"/>
+          </w:tcPr>
+          <w:p>
+            <w:r/>
+            <w:r>
+              <w:rPr>
+                <w:b w:val="0"/>
+              </w:rPr>
+              <w:t>Stays user-triggered</w:t>
+            </w:r>
+          </w:p>
+        </w:tc>
+      </w:tr>
+      <w:tr>
+        <w:tc>
+          <w:tcPr>
+            <w:tcW w:type="dxa" w:w="2160"/>
+          </w:tcPr>
+          <w:p>
+            <w:r/>
+            <w:r>
+              <w:rPr>
+                <w:b w:val="0"/>
+              </w:rPr>
+              <w:t>Export to HubSpot, Export CSV</w:t>
+            </w:r>
+          </w:p>
+        </w:tc>
+        <w:tc>
+          <w:tcPr>
+            <w:tcW w:type="dxa" w:w="2160"/>
+          </w:tcPr>
+          <w:p>
+            <w:r/>
+            <w:r>
+              <w:rPr>
+                <w:b w:val="0"/>
+              </w:rPr>
+              <w:t>Menu</w:t>
+            </w:r>
+          </w:p>
+        </w:tc>
+        <w:tc>
+          <w:tcPr>
+            <w:tcW w:type="dxa" w:w="2160"/>
+          </w:tcPr>
+          <w:p>
+            <w:r/>
+            <w:r>
+              <w:rPr>
+                <w:b w:val="0"/>
+              </w:rPr>
+              <w:t>—</w:t>
+            </w:r>
+          </w:p>
+        </w:tc>
+        <w:tc>
+          <w:tcPr>
+            <w:tcW w:type="dxa" w:w="2160"/>
+          </w:tcPr>
+          <w:p>
+            <w:r/>
+            <w:r>
+              <w:rPr>
+                <w:b w:val="0"/>
+              </w:rPr>
+              <w:t>Stays user-triggered</w:t>
+            </w:r>
+          </w:p>
+        </w:tc>
+      </w:tr>
+      <w:tr>
+        <w:tc>
+          <w:tcPr>
+            <w:tcW w:type="dxa" w:w="2160"/>
+          </w:tcPr>
+          <w:p>
+            <w:r/>
+            <w:r>
+              <w:rPr>
+                <w:b w:val="0"/>
+              </w:rPr>
+              <w:t>Backup / Restore (manual)</w:t>
+            </w:r>
+          </w:p>
+        </w:tc>
+        <w:tc>
+          <w:tcPr>
+            <w:tcW w:type="dxa" w:w="2160"/>
+          </w:tcPr>
+          <w:p>
+            <w:r/>
+            <w:r>
+              <w:rPr>
+                <w:b w:val="0"/>
+              </w:rPr>
+              <w:t>Settings</w:t>
+            </w:r>
+          </w:p>
+        </w:tc>
+        <w:tc>
+          <w:tcPr>
+            <w:tcW w:type="dxa" w:w="2160"/>
+          </w:tcPr>
+          <w:p>
+            <w:r/>
+            <w:r>
+              <w:rPr>
+                <w:b w:val="0"/>
+              </w:rPr>
+              <w:t>—</w:t>
+            </w:r>
+          </w:p>
+        </w:tc>
+        <w:tc>
+          <w:tcPr>
+            <w:tcW w:type="dxa" w:w="2160"/>
+          </w:tcPr>
+          <w:p>
+            <w:r/>
+            <w:r>
+              <w:rPr>
+                <w:b w:val="0"/>
+              </w:rPr>
+              <w:t>Stays user-triggered</w:t>
+            </w:r>
+          </w:p>
+        </w:tc>
+      </w:tr>
+    </w:tbl>
+    <w:p/>
+    <w:p>
+      <w:pPr>
+        <w:pStyle w:val="Heading3"/>
+      </w:pPr>
+      <w:r>
+        <w:rPr>
+          <w:b w:val="0"/>
+        </w:rPr>
+        <w:t>A.2 Jobs that already run automatically</w:t>
+      </w:r>
+    </w:p>
+    <w:tbl>
+      <w:tblPr>
+        <w:tblStyle w:val="TableGrid"/>
+        <w:tblW w:type="auto" w:w="0"/>
+        <w:tblLook w:firstColumn="1" w:firstRow="1" w:lastColumn="0" w:lastRow="0" w:noHBand="0" w:noVBand="1" w:val="04A0"/>
+      </w:tblPr>
+      <w:tblGrid>
+        <w:gridCol w:w="4320"/>
+        <w:gridCol w:w="4320"/>
+      </w:tblGrid>
+      <w:tr>
+        <w:tc>
+          <w:tcPr>
+            <w:tcW w:type="dxa" w:w="4320"/>
+          </w:tcPr>
+          <w:p>
+            <w:r/>
+            <w:r>
+              <w:rPr>
+                <w:b/>
+              </w:rPr>
+              <w:t>Job</w:t>
+            </w:r>
+          </w:p>
+        </w:tc>
+        <w:tc>
+          <w:tcPr>
+            <w:tcW w:type="dxa" w:w="4320"/>
+          </w:tcPr>
+          <w:p>
+            <w:r/>
+            <w:r>
+              <w:rPr>
+                <w:b/>
+              </w:rPr>
+              <w:t>When it runs</w:t>
+            </w:r>
+          </w:p>
+        </w:tc>
+      </w:tr>
+      <w:tr>
+        <w:tc>
+          <w:tcPr>
+            <w:tcW w:type="dxa" w:w="4320"/>
+          </w:tcPr>
+          <w:p>
+            <w:r/>
+            <w:r>
+              <w:rPr>
+                <w:b w:val="0"/>
+              </w:rPr>
+              <w:t>Open the Setup wizard</w:t>
+            </w:r>
+          </w:p>
+        </w:tc>
+        <w:tc>
+          <w:tcPr>
+            <w:tcW w:type="dxa" w:w="4320"/>
+          </w:tcPr>
+          <w:p>
+            <w:r/>
+            <w:r>
+              <w:rPr>
+                <w:b w:val="0"/>
+              </w:rPr>
+              <w:t>On first install (</w:t>
+            </w:r>
+            <w:r>
+              <w:rPr>
+                <w:rFonts w:ascii="Consolas" w:hAnsi="Consolas"/>
+                <w:b w:val="0"/>
+              </w:rPr>
+              <w:t>background.js</w:t>
+            </w:r>
+            <w:r>
+              <w:rPr>
+                <w:b w:val="0"/>
+              </w:rPr>
+              <w:t xml:space="preserve">, </w:t>
+            </w:r>
+            <w:r>
+              <w:rPr>
+                <w:rFonts w:ascii="Consolas" w:hAnsi="Consolas"/>
+                <w:b w:val="0"/>
+              </w:rPr>
+              <w:t>onInstalled</w:t>
+            </w:r>
+            <w:r>
+              <w:rPr>
+                <w:b w:val="0"/>
+              </w:rPr>
+              <w:t>)</w:t>
+            </w:r>
+          </w:p>
+        </w:tc>
+      </w:tr>
+      <w:tr>
+        <w:tc>
+          <w:tcPr>
+            <w:tcW w:type="dxa" w:w="4320"/>
+          </w:tcPr>
+          <w:p>
+            <w:r/>
+            <w:r>
+              <w:rPr>
+                <w:b w:val="0"/>
+              </w:rPr>
+              <w:t>Prioritize newly added companies</w:t>
+            </w:r>
+          </w:p>
+        </w:tc>
+        <w:tc>
+          <w:tcPr>
+            <w:tcW w:type="dxa" w:w="4320"/>
+          </w:tcPr>
+          <w:p>
+            <w:r/>
+            <w:r>
+              <w:rPr>
+                <w:b w:val="0"/>
+              </w:rPr>
+              <w:t>After workbook import, HubSpot import and Discovery merge (</w:t>
+            </w:r>
+            <w:r>
+              <w:rPr>
+                <w:rFonts w:ascii="Consolas" w:hAnsi="Consolas"/>
+                <w:b w:val="0"/>
+              </w:rPr>
+              <w:t>autoPrioritizeNewCompanies</w:t>
+            </w:r>
+            <w:r>
+              <w:rPr>
+                <w:b w:val="0"/>
+              </w:rPr>
+              <w:t>)</w:t>
+            </w:r>
+          </w:p>
+        </w:tc>
+      </w:tr>
+      <w:tr>
+        <w:tc>
+          <w:tcPr>
+            <w:tcW w:type="dxa" w:w="4320"/>
+          </w:tcPr>
+          <w:p>
+            <w:r/>
+            <w:r>
+              <w:rPr>
+                <w:b w:val="0"/>
+              </w:rPr>
+              <w:t>Sync LinkedIn links into the workbook</w:t>
+            </w:r>
+          </w:p>
+        </w:tc>
+        <w:tc>
+          <w:tcPr>
+            <w:tcW w:type="dxa" w:w="4320"/>
+          </w:tcPr>
+          <w:p>
+            <w:r/>
+            <w:r>
+              <w:rPr>
+                <w:b w:val="0"/>
+              </w:rPr>
+              <w:t>Every time the workbook loads (</w:t>
+            </w:r>
+            <w:r>
+              <w:rPr>
+                <w:rFonts w:ascii="Consolas" w:hAnsi="Consolas"/>
+                <w:b w:val="0"/>
+              </w:rPr>
+              <w:t>syncLinkedinLinksToWorkbook</w:t>
+            </w:r>
+            <w:r>
+              <w:rPr>
+                <w:b w:val="0"/>
+              </w:rPr>
+              <w:t>): the silent-repair model</w:t>
+            </w:r>
+          </w:p>
+        </w:tc>
+      </w:tr>
+      <w:tr>
+        <w:tc>
+          <w:tcPr>
+            <w:tcW w:type="dxa" w:w="4320"/>
+          </w:tcPr>
+          <w:p>
+            <w:r/>
+            <w:r>
+              <w:rPr>
+                <w:b w:val="0"/>
+              </w:rPr>
+              <w:t>Extract the company for scanned leads</w:t>
+            </w:r>
+          </w:p>
+        </w:tc>
+        <w:tc>
+          <w:tcPr>
+            <w:tcW w:type="dxa" w:w="4320"/>
+          </w:tcPr>
+          <w:p>
+            <w:r/>
+            <w:r>
+              <w:rPr>
+                <w:b w:val="0"/>
+              </w:rPr>
+              <w:t>During every scan, for leads missing one (AI)</w:t>
+            </w:r>
+          </w:p>
+        </w:tc>
+      </w:tr>
+      <w:tr>
+        <w:tc>
+          <w:tcPr>
+            <w:tcW w:type="dxa" w:w="4320"/>
+          </w:tcPr>
+          <w:p>
+            <w:r/>
+            <w:r>
+              <w:rPr>
+                <w:b w:val="0"/>
+              </w:rPr>
+              <w:t>Prioritize scanned leads with the Sales Mentor</w:t>
+            </w:r>
+          </w:p>
+        </w:tc>
+        <w:tc>
+          <w:tcPr>
+            <w:tcW w:type="dxa" w:w="4320"/>
+          </w:tcPr>
+          <w:p>
+            <w:r/>
+            <w:r>
+              <w:rPr>
+                <w:b w:val="0"/>
+              </w:rPr>
+              <w:t>During every scan</w:t>
+            </w:r>
+          </w:p>
+        </w:tc>
+      </w:tr>
+      <w:tr>
+        <w:tc>
+          <w:tcPr>
+            <w:tcW w:type="dxa" w:w="4320"/>
+          </w:tcPr>
+          <w:p>
+            <w:r/>
+            <w:r>
+              <w:rPr>
+                <w:b w:val="0"/>
+              </w:rPr>
+              <w:t>Tag leads with their target-account signal</w:t>
+            </w:r>
+          </w:p>
+        </w:tc>
+        <w:tc>
+          <w:tcPr>
+            <w:tcW w:type="dxa" w:w="4320"/>
+          </w:tcPr>
+          <w:p>
+            <w:r/>
+            <w:r>
+              <w:rPr>
+                <w:b w:val="0"/>
+              </w:rPr>
+              <w:t>During every scan</w:t>
+            </w:r>
+          </w:p>
+        </w:tc>
+      </w:tr>
+      <w:tr>
+        <w:tc>
+          <w:tcPr>
+            <w:tcW w:type="dxa" w:w="4320"/>
+          </w:tcPr>
+          <w:p>
+            <w:r/>
+            <w:r>
+              <w:rPr>
+                <w:b w:val="0"/>
+              </w:rPr>
+              <w:t>Stop a scan at the daily LinkedIn limit</w:t>
+            </w:r>
+          </w:p>
+        </w:tc>
+        <w:tc>
+          <w:tcPr>
+            <w:tcW w:type="dxa" w:w="4320"/>
+          </w:tcPr>
+          <w:p>
+            <w:r/>
+            <w:r>
+              <w:rPr>
+                <w:b w:val="0"/>
+              </w:rPr>
+              <w:t>During every scan</w:t>
+            </w:r>
+          </w:p>
+        </w:tc>
+      </w:tr>
+      <w:tr>
+        <w:tc>
+          <w:tcPr>
+            <w:tcW w:type="dxa" w:w="4320"/>
+          </w:tcPr>
+          <w:p>
+            <w:r/>
+            <w:r>
+              <w:rPr>
+                <w:b w:val="0"/>
+              </w:rPr>
+              <w:t>Daily backup</w:t>
+            </w:r>
+          </w:p>
+        </w:tc>
+        <w:tc>
+          <w:tcPr>
+            <w:tcW w:type="dxa" w:w="4320"/>
+          </w:tcPr>
+          <w:p>
+            <w:r/>
+            <w:r>
+              <w:rPr>
+                <w:b w:val="0"/>
+              </w:rPr>
+              <w:t>When due, checked when a SalesTeam page is open (no alarm)</w:t>
+            </w:r>
+          </w:p>
+        </w:tc>
+      </w:tr>
+      <w:tr>
+        <w:tc>
+          <w:tcPr>
+            <w:tcW w:type="dxa" w:w="4320"/>
+          </w:tcPr>
+          <w:p>
+            <w:r/>
+            <w:r>
+              <w:rPr>
+                <w:b w:val="0"/>
+              </w:rPr>
+              <w:t>Export closed Activity Log days to /log</w:t>
+            </w:r>
+          </w:p>
+        </w:tc>
+        <w:tc>
+          <w:tcPr>
+            <w:tcW w:type="dxa" w:w="4320"/>
+          </w:tcPr>
+          <w:p>
+            <w:r/>
+            <w:r>
+              <w:rPr>
+                <w:b w:val="0"/>
+              </w:rPr>
+              <w:t>When the Scan button is pressed</w:t>
+            </w:r>
+          </w:p>
+        </w:tc>
+      </w:tr>
+    </w:tbl>
+    <w:p/>
+    <w:p>
+      <w:r>
+        <w:rPr>
+          <w:b w:val="0"/>
+        </w:rPr>
+        <w:t>None of these spends LinkedIn touches outside a scan the user started. **That is the posture that</w:t>
+      </w:r>
+    </w:p>
+    <w:p>
+      <w:r>
+        <w:rPr>
+          <w:b w:val="0"/>
+        </w:rPr>
+        <w:t>R12.2 changes. The change was approved on 2026-09-24 (R12.2.3).**</w:t>
       </w:r>
     </w:p>
     <w:sectPr>

</xml_diff>